<commit_message>
adds reports and network analysis graph.r
</commit_message>
<xml_diff>
--- a/report/report_draft.docx
+++ b/report/report_draft.docx
@@ -4,369 +4,1704 @@
   <w:body>
     <w:p>
       <w:pPr>
-        <w:rPr>
-          <w:rFonts w:ascii="Times New Roman" w:hAnsi="Times New Roman" w:cs="Times New Roman"/>
+        <w:spacing w:before="240" w:after="240" w:line="240" w:lineRule="auto"/>
+        <w:rPr>
+          <w:rFonts w:ascii="Times New Roman" w:eastAsia="Batang" w:hAnsi="Times New Roman" w:cs="Times New Roman"/>
+          <w:kern w:val="0"/>
+          <w:lang w:val="en-US"/>
+          <w14:ligatures w14:val="none"/>
+        </w:rPr>
+      </w:pPr>
+      <w:r>
+        <w:rPr>
+          <w:rFonts w:ascii="Times New Roman" w:eastAsia="Times New Roman" w:hAnsi="Times New Roman" w:cs="Times New Roman"/>
           <w:b/>
           <w:bCs/>
-        </w:rPr>
-      </w:pPr>
-      <w:r>
-        <w:rPr>
-          <w:rFonts w:ascii="Times New Roman" w:hAnsi="Times New Roman" w:cs="Times New Roman"/>
+          <w:color w:val="000000"/>
+          <w:kern w:val="0"/>
+          <w14:ligatures w14:val="none"/>
+        </w:rPr>
+        <w:t>Intro</w:t>
+      </w:r>
+      <w:r>
+        <w:rPr>
+          <w:rFonts w:ascii="Times New Roman" w:eastAsia="Batang" w:hAnsi="Times New Roman" w:cs="Times New Roman"/>
           <w:b/>
           <w:bCs/>
-        </w:rPr>
-        <w:t>Introduction</w:t>
-      </w:r>
-    </w:p>
-    <w:p>
-      <w:pPr>
-        <w:rPr>
-          <w:rFonts w:ascii="Times New Roman" w:eastAsia="Times New Roman" w:hAnsi="Times New Roman" w:cs="Times New Roman"/>
-          <w:kern w:val="0"/>
-          <w14:ligatures w14:val="none"/>
-        </w:rPr>
-      </w:pPr>
-      <w:r>
-        <w:rPr>
-          <w:rFonts w:ascii="Times New Roman" w:eastAsia="Times New Roman" w:hAnsi="Times New Roman" w:cs="Times New Roman"/>
-          <w:kern w:val="0"/>
-          <w14:ligatures w14:val="none"/>
-        </w:rPr>
-        <w:t>Online platforms have become central spaces for political communication, where information is not only distributed but also actively interpreted and reshaped by users. In particular, YouTube provides a rich environment in which political discourse emerges through both content production and audience engagement. The forms of user-generated contents, including user comments, capture how political issues are framed, discussed, and emotionally expressed across different communities.</w:t>
-      </w:r>
-    </w:p>
-    <w:p>
-      <w:pPr>
-        <w:rPr>
-          <w:rFonts w:ascii="Times New Roman" w:eastAsia="Times New Roman" w:hAnsi="Times New Roman" w:cs="Times New Roman"/>
-          <w:kern w:val="0"/>
-          <w14:ligatures w14:val="none"/>
-        </w:rPr>
-      </w:pPr>
-      <w:r>
-        <w:rPr>
-          <w:rFonts w:ascii="Times New Roman" w:eastAsia="Times New Roman" w:hAnsi="Times New Roman" w:cs="Times New Roman"/>
-          <w:kern w:val="0"/>
-          <w14:ligatures w14:val="none"/>
-        </w:rPr>
-        <w:t>Language plays a critical role in political communication, as patterns of word choice often reflect underlying ideological positions. Prior research has shown that distinct vocabularies can signal differences in political identity and framing, allowing computational methods to detect semantic variation across groups</w:t>
-      </w:r>
-      <w:r>
-        <w:rPr>
-          <w:rFonts w:ascii="Times New Roman" w:eastAsia="Times New Roman" w:hAnsi="Times New Roman" w:cs="Times New Roman"/>
-          <w:kern w:val="0"/>
-          <w14:ligatures w14:val="none"/>
-        </w:rPr>
-        <w:t xml:space="preserve">. </w:t>
-      </w:r>
-      <w:r>
-        <w:rPr>
-          <w:rFonts w:ascii="Times New Roman" w:eastAsia="Times New Roman" w:hAnsi="Times New Roman" w:cs="Times New Roman"/>
-          <w:kern w:val="0"/>
-          <w14:ligatures w14:val="none"/>
-        </w:rPr>
-        <w:t>At the same time, emotional expression is deeply embedded in political discourse, with sentiment and affective language shaping how issues are perceived and evaluated</w:t>
-      </w:r>
-      <w:r>
-        <w:rPr>
-          <w:rFonts w:ascii="Times New Roman" w:eastAsia="Times New Roman" w:hAnsi="Times New Roman" w:cs="Times New Roman"/>
-          <w:kern w:val="0"/>
-          <w14:ligatures w14:val="none"/>
-        </w:rPr>
-        <w:t>.</w:t>
-      </w:r>
-    </w:p>
-    <w:p>
-      <w:pPr>
-        <w:rPr>
-          <w:rFonts w:ascii="Times New Roman" w:eastAsia="Times New Roman" w:hAnsi="Times New Roman" w:cs="Times New Roman"/>
-          <w:kern w:val="0"/>
-          <w14:ligatures w14:val="none"/>
-        </w:rPr>
-      </w:pPr>
-      <w:r>
-        <w:rPr>
-          <w:rFonts w:ascii="Times New Roman" w:eastAsia="Times New Roman" w:hAnsi="Times New Roman" w:cs="Times New Roman"/>
-          <w:kern w:val="0"/>
-          <w14:ligatures w14:val="none"/>
-        </w:rPr>
-        <w:t>Beyond linguistic patterns, the structure of relationships between content producers can reveal broader dynamics of political alignment. Network-based analyses have consistently found that political communication tends to form ideologically clustered communities, often characterized by homophily and the emergence of echo chambers</w:t>
-      </w:r>
-      <w:r>
-        <w:rPr>
-          <w:rFonts w:ascii="Times New Roman" w:eastAsia="Times New Roman" w:hAnsi="Times New Roman" w:cs="Times New Roman"/>
-          <w:kern w:val="0"/>
-          <w14:ligatures w14:val="none"/>
-        </w:rPr>
-        <w:t xml:space="preserve">. </w:t>
-      </w:r>
-      <w:r>
-        <w:rPr>
-          <w:rFonts w:ascii="Times New Roman" w:eastAsia="Times New Roman" w:hAnsi="Times New Roman" w:cs="Times New Roman"/>
-          <w:kern w:val="0"/>
-          <w14:ligatures w14:val="none"/>
-        </w:rPr>
-        <w:t>Such structural patterns provide a complementary perspective to text-based analysis, capturing how actors are positioned within the broader communication landscape.</w:t>
-      </w:r>
-    </w:p>
-    <w:p>
-      <w:pPr>
-        <w:rPr>
-          <w:rFonts w:ascii="Times New Roman" w:eastAsia="Times New Roman" w:hAnsi="Times New Roman" w:cs="Times New Roman"/>
-          <w:kern w:val="0"/>
-          <w14:ligatures w14:val="none"/>
-        </w:rPr>
-      </w:pPr>
-      <w:r>
-        <w:rPr>
-          <w:rFonts w:ascii="Times New Roman" w:eastAsia="Times New Roman" w:hAnsi="Times New Roman" w:cs="Times New Roman"/>
-          <w:kern w:val="0"/>
-          <w14:ligatures w14:val="none"/>
-        </w:rPr>
-        <w:t>Building on these perspectives, this study examines whether ideologically distinct YouTube channels exhibit statistically significant semantic and emotional differences in their use of language when discussing similar political issues. In addition, it explores whether these linguistic patterns correspond to network-level clustering among channels. By integrating textual analysis with network modeling, the study aims to offer a comprehensive account of how political polarization is reflected in online video-based discourse.</w:t>
-      </w:r>
-    </w:p>
-    <w:p>
-      <w:pPr>
-        <w:rPr>
-          <w:rFonts w:ascii="Times New Roman" w:hAnsi="Times New Roman" w:cs="Times New Roman"/>
+          <w:color w:val="000000"/>
+          <w:kern w:val="0"/>
+          <w:lang w:val="en-US"/>
+          <w14:ligatures w14:val="none"/>
+        </w:rPr>
+        <w:t>duction</w:t>
+      </w:r>
+    </w:p>
+    <w:p>
+      <w:pPr>
+        <w:spacing w:before="240" w:after="240" w:line="240" w:lineRule="auto"/>
+        <w:rPr>
+          <w:rFonts w:ascii="Times New Roman" w:eastAsia="Times New Roman" w:hAnsi="Times New Roman" w:cs="Times New Roman"/>
+          <w:kern w:val="0"/>
+          <w14:ligatures w14:val="none"/>
+        </w:rPr>
+      </w:pPr>
+      <w:r>
+        <w:rPr>
+          <w:rFonts w:ascii="Times New Roman" w:eastAsia="Times New Roman" w:hAnsi="Times New Roman" w:cs="Times New Roman"/>
+          <w:color w:val="000000"/>
+          <w:kern w:val="0"/>
+          <w14:ligatures w14:val="none"/>
+        </w:rPr>
+        <w:t>Online platforms have become central spaces for political communication, where information is not only distributed but also actively interpreted and reshaped by users. In particular, YouTube provides a unique environment in which political discourse emerges through both content production and audience engagement, as videos and user comments jointly reflect how political issues are framed, discussed, and emotionally expressed.</w:t>
+      </w:r>
+    </w:p>
+    <w:p>
+      <w:pPr>
+        <w:spacing w:before="240" w:after="240" w:line="240" w:lineRule="auto"/>
+        <w:rPr>
+          <w:rFonts w:ascii="Times New Roman" w:eastAsia="Times New Roman" w:hAnsi="Times New Roman" w:cs="Times New Roman"/>
+          <w:kern w:val="0"/>
+          <w14:ligatures w14:val="none"/>
+        </w:rPr>
+      </w:pPr>
+      <w:r>
+        <w:rPr>
+          <w:rFonts w:ascii="Times New Roman" w:eastAsia="Times New Roman" w:hAnsi="Times New Roman" w:cs="Times New Roman"/>
+          <w:color w:val="000000"/>
+          <w:kern w:val="0"/>
+          <w14:ligatures w14:val="none"/>
+        </w:rPr>
+        <w:t>Language plays a critical role in political communication, as patterns of word choice often reflect underlying ideological positions. At the same time, emotional expression is deeply embedded in political discourse, with sentiment and affective language shaping how issues are perceived and evaluated.</w:t>
+      </w:r>
+    </w:p>
+    <w:p>
+      <w:pPr>
+        <w:spacing w:before="240" w:after="240" w:line="240" w:lineRule="auto"/>
+        <w:rPr>
+          <w:rFonts w:ascii="Times New Roman" w:eastAsia="Times New Roman" w:hAnsi="Times New Roman" w:cs="Times New Roman"/>
+          <w:kern w:val="0"/>
+          <w14:ligatures w14:val="none"/>
+        </w:rPr>
+      </w:pPr>
+      <w:r>
+        <w:rPr>
+          <w:rFonts w:ascii="Times New Roman" w:eastAsia="Times New Roman" w:hAnsi="Times New Roman" w:cs="Times New Roman"/>
+          <w:color w:val="000000"/>
+          <w:kern w:val="0"/>
+          <w14:ligatures w14:val="none"/>
+        </w:rPr>
+        <w:t>Beyond language, the relationships between content producers provide insight into political alignment. Network-based analyses suggest that political communication often forms ideologically clustered communities, offering a structural perspective that complements text-based analysis.</w:t>
+      </w:r>
+    </w:p>
+    <w:p>
+      <w:pPr>
+        <w:spacing w:before="240" w:after="240" w:line="240" w:lineRule="auto"/>
+        <w:rPr>
+          <w:rFonts w:ascii="Times New Roman" w:eastAsia="Times New Roman" w:hAnsi="Times New Roman" w:cs="Times New Roman"/>
+          <w:kern w:val="0"/>
+          <w14:ligatures w14:val="none"/>
+        </w:rPr>
+      </w:pPr>
+      <w:r>
+        <w:rPr>
+          <w:rFonts w:ascii="Times New Roman" w:eastAsia="Times New Roman" w:hAnsi="Times New Roman" w:cs="Times New Roman"/>
+          <w:color w:val="000000"/>
+          <w:kern w:val="0"/>
+          <w14:ligatures w14:val="none"/>
+        </w:rPr>
+        <w:t>Building on these perspectives, this study examines whether ideologically distinct YouTube channels differ in language use and whether these differences correspond to patterns in the channel network. By integrating textual and network analysis, the study aims to provide a more comprehensive understanding of political polarization in online discourse.</w:t>
+      </w:r>
+    </w:p>
+    <w:p>
+      <w:pPr>
+        <w:spacing w:after="0" w:line="240" w:lineRule="auto"/>
+        <w:rPr>
+          <w:rFonts w:ascii="Times New Roman" w:eastAsia="Times New Roman" w:hAnsi="Times New Roman" w:cs="Times New Roman"/>
+          <w:kern w:val="0"/>
+          <w14:ligatures w14:val="none"/>
+        </w:rPr>
+      </w:pPr>
+    </w:p>
+    <w:p>
+      <w:pPr>
+        <w:spacing w:line="240" w:lineRule="auto"/>
+        <w:rPr>
+          <w:rFonts w:ascii="Times New Roman" w:eastAsia="Times New Roman" w:hAnsi="Times New Roman" w:cs="Times New Roman"/>
+          <w:kern w:val="0"/>
+          <w14:ligatures w14:val="none"/>
+        </w:rPr>
+      </w:pPr>
+      <w:r>
+        <w:rPr>
+          <w:rFonts w:ascii="Times New Roman" w:eastAsia="Times New Roman" w:hAnsi="Times New Roman" w:cs="Times New Roman"/>
           <w:b/>
           <w:bCs/>
-        </w:rPr>
-      </w:pPr>
-      <w:r>
-        <w:rPr>
-          <w:rFonts w:ascii="Times New Roman" w:hAnsi="Times New Roman" w:cs="Times New Roman"/>
+          <w:color w:val="000000"/>
+          <w:kern w:val="0"/>
+          <w14:ligatures w14:val="none"/>
+        </w:rPr>
+        <w:t>Research Question</w:t>
+      </w:r>
+    </w:p>
+    <w:p>
+      <w:pPr>
+        <w:spacing w:before="240" w:after="240" w:line="240" w:lineRule="auto"/>
+        <w:rPr>
+          <w:rFonts w:ascii="Times New Roman" w:eastAsia="Times New Roman" w:hAnsi="Times New Roman" w:cs="Times New Roman"/>
+          <w:kern w:val="0"/>
+          <w14:ligatures w14:val="none"/>
+        </w:rPr>
+      </w:pPr>
+      <w:r>
+        <w:rPr>
+          <w:rFonts w:ascii="Times New Roman" w:eastAsia="Times New Roman" w:hAnsi="Times New Roman" w:cs="Times New Roman"/>
+          <w:color w:val="000000"/>
+          <w:kern w:val="0"/>
+          <w14:ligatures w14:val="none"/>
+        </w:rPr>
+        <w:t>This study aims to investigate the extent to which political content on YouTube exhibits polarization across both linguistic and structural dimensions. As online platforms increasingly shape how political information is produced and consumed, it is important to examine not only differences in opinions, but also how these differences are reflected in language use and interaction patterns among ideological groups.</w:t>
+      </w:r>
+    </w:p>
+    <w:p>
+      <w:pPr>
+        <w:spacing w:before="240" w:after="240" w:line="240" w:lineRule="auto"/>
+        <w:rPr>
+          <w:rFonts w:ascii="Times New Roman" w:eastAsia="Times New Roman" w:hAnsi="Times New Roman" w:cs="Times New Roman"/>
+          <w:kern w:val="0"/>
+          <w14:ligatures w14:val="none"/>
+        </w:rPr>
+      </w:pPr>
+      <w:r>
+        <w:rPr>
+          <w:rFonts w:ascii="Times New Roman" w:eastAsia="Times New Roman" w:hAnsi="Times New Roman" w:cs="Times New Roman"/>
+          <w:color w:val="000000"/>
+          <w:kern w:val="0"/>
+          <w14:ligatures w14:val="none"/>
+        </w:rPr>
+        <w:t>To this end, the analysis is guided by the following research questions:</w:t>
+      </w:r>
+    </w:p>
+    <w:p>
+      <w:pPr>
+        <w:spacing w:before="240" w:after="240" w:line="240" w:lineRule="auto"/>
+        <w:rPr>
+          <w:rFonts w:ascii="Times New Roman" w:eastAsia="Times New Roman" w:hAnsi="Times New Roman" w:cs="Times New Roman"/>
+          <w:kern w:val="0"/>
+          <w14:ligatures w14:val="none"/>
+        </w:rPr>
+      </w:pPr>
+      <w:r>
+        <w:rPr>
+          <w:rFonts w:ascii="Times New Roman" w:eastAsia="Times New Roman" w:hAnsi="Times New Roman" w:cs="Times New Roman"/>
           <w:b/>
           <w:bCs/>
-        </w:rPr>
-        <w:t>Research Question</w:t>
-      </w:r>
-    </w:p>
-    <w:p>
-      <w:pPr>
-        <w:pStyle w:val="isselectedend"/>
-      </w:pPr>
-      <w:r>
-        <w:t>This study aims to investigate the extent to which political content on YouTube exhibits polarization across both linguistic and structural dimensions. As online platforms increasingly shape how political information is produced and consumed, it is important to examine not only differences in opinions, but also how these differences are reflected in language use and interaction patterns among ideological groups.</w:t>
-      </w:r>
-    </w:p>
-    <w:p>
-      <w:pPr>
-        <w:pStyle w:val="isselectedend"/>
-      </w:pPr>
-      <w:r>
-        <w:t>The primary research question guiding this study is: To what extent does political content on YouTube exhibit linguistic, emotional, and structural polarization between progressive and conservative channels?</w:t>
-      </w:r>
-    </w:p>
-    <w:p>
-      <w:pPr>
-        <w:pStyle w:val="isselectedend"/>
-      </w:pPr>
-      <w:r>
-        <w:t xml:space="preserve">To address this question, the analysis focuses on three complementary dimensions. First, a linguistic analysis is conducted to identify differences in vocabulary usage between progressive </w:t>
-      </w:r>
-      <w:r>
-        <w:lastRenderedPageBreak/>
-        <w:t>and conservative channels. Using TF-IDF, the study examines whether each group relies on distinct sets of keywords when discussing political topics, indicating divergence in framing and emphasis.</w:t>
-      </w:r>
-    </w:p>
-    <w:p>
-      <w:pPr>
-        <w:pStyle w:val="NormalWeb"/>
-        <w:rPr>
-          <w:rFonts w:eastAsia="Batang"/>
-          <w:lang w:val="en-US"/>
-        </w:rPr>
-      </w:pPr>
-      <w:r>
-        <w:t>Second, an emotional analysis is performed to assess whether the tone of language differs across ideological groups. By applying sentiment analysis, the study evaluates whether progressive and conservative channels exhibit systematic differences in the use of positive and negative language when discussing political keywords or issues.</w:t>
-      </w:r>
-    </w:p>
-    <w:p>
-      <w:pPr>
-        <w:pStyle w:val="isselectedend"/>
-      </w:pPr>
-      <w:r>
-        <w:t>Third, a structural perspective is incorporated to explore patterns of interaction and potential clustering among content. Rather than relying on full recommendation system modeling, this study examines whether there is a tendency for content to be more closely associated within the same ideological group, suggesting the presence of weak forms of echo chamber dynamics.</w:t>
-      </w:r>
-    </w:p>
-    <w:p>
-      <w:pPr>
-        <w:pStyle w:val="NormalWeb"/>
-      </w:pPr>
-      <w:r>
-        <w:t>By integrating these three dimensions—linguistic, emotional, and structural—this study seeks to provide a more comprehensive understanding of how political polarization manifests on YouTube, both in the way ideas are expressed and in how content is organized within the platform.</w:t>
-      </w:r>
-    </w:p>
-    <w:p>
-      <w:pPr>
-        <w:rPr>
-          <w:rFonts w:ascii="Times New Roman" w:hAnsi="Times New Roman" w:cs="Times New Roman"/>
+          <w:color w:val="000000"/>
+          <w:kern w:val="0"/>
+          <w14:ligatures w14:val="none"/>
+        </w:rPr>
+        <w:t>RQ1.</w:t>
+      </w:r>
+      <w:r>
+        <w:rPr>
+          <w:rFonts w:ascii="Times New Roman" w:eastAsia="Times New Roman" w:hAnsi="Times New Roman" w:cs="Times New Roman"/>
+          <w:color w:val="000000"/>
+          <w:kern w:val="0"/>
+          <w14:ligatures w14:val="none"/>
+        </w:rPr>
+        <w:t xml:space="preserve"> </w:t>
+      </w:r>
+      <w:r>
+        <w:rPr>
+          <w:rFonts w:ascii="Times New Roman" w:eastAsia="Times New Roman" w:hAnsi="Times New Roman" w:cs="Times New Roman"/>
+          <w:i/>
+          <w:iCs/>
+          <w:color w:val="000000"/>
+          <w:kern w:val="0"/>
+          <w14:ligatures w14:val="none"/>
+        </w:rPr>
+        <w:t>Do ideologically distinct YouTube channels exhibit systematic differences in their language use when discussing a shared political issue?</w:t>
+      </w:r>
+      <w:r>
+        <w:rPr>
+          <w:rFonts w:ascii="Times New Roman" w:eastAsia="Times New Roman" w:hAnsi="Times New Roman" w:cs="Times New Roman"/>
+          <w:i/>
+          <w:iCs/>
+          <w:color w:val="000000"/>
+          <w:kern w:val="0"/>
+          <w14:ligatures w14:val="none"/>
+        </w:rPr>
+        <w:br/>
+      </w:r>
+      <w:r>
+        <w:rPr>
+          <w:rFonts w:ascii="Times New Roman" w:eastAsia="Times New Roman" w:hAnsi="Times New Roman" w:cs="Times New Roman"/>
+          <w:color w:val="000000"/>
+          <w:kern w:val="0"/>
+          <w14:ligatures w14:val="none"/>
+        </w:rPr>
+        <w:t>This question focuses on identifying semantic and emotional variation across channels, examining whether differences in vocabulary, phrasing, and sentiment reflect underlying ideological positions.</w:t>
+      </w:r>
+    </w:p>
+    <w:p>
+      <w:pPr>
+        <w:spacing w:before="240" w:after="240" w:line="240" w:lineRule="auto"/>
+        <w:rPr>
+          <w:rFonts w:ascii="Times New Roman" w:eastAsia="Times New Roman" w:hAnsi="Times New Roman" w:cs="Times New Roman"/>
+          <w:kern w:val="0"/>
+          <w14:ligatures w14:val="none"/>
+        </w:rPr>
+      </w:pPr>
+      <w:r>
+        <w:rPr>
+          <w:rFonts w:ascii="Times New Roman" w:eastAsia="Times New Roman" w:hAnsi="Times New Roman" w:cs="Times New Roman"/>
           <w:b/>
           <w:bCs/>
-        </w:rPr>
-      </w:pPr>
-      <w:r>
-        <w:rPr>
-          <w:rFonts w:ascii="Times New Roman" w:hAnsi="Times New Roman" w:cs="Times New Roman"/>
+          <w:color w:val="000000"/>
+          <w:kern w:val="0"/>
+          <w14:ligatures w14:val="none"/>
+        </w:rPr>
+        <w:t>RQ2.</w:t>
+      </w:r>
+      <w:r>
+        <w:rPr>
+          <w:rFonts w:ascii="Times New Roman" w:eastAsia="Times New Roman" w:hAnsi="Times New Roman" w:cs="Times New Roman"/>
+          <w:color w:val="000000"/>
+          <w:kern w:val="0"/>
+          <w14:ligatures w14:val="none"/>
+        </w:rPr>
+        <w:t xml:space="preserve"> </w:t>
+      </w:r>
+      <w:r>
+        <w:rPr>
+          <w:rFonts w:ascii="Times New Roman" w:eastAsia="Times New Roman" w:hAnsi="Times New Roman" w:cs="Times New Roman"/>
+          <w:i/>
+          <w:iCs/>
+          <w:color w:val="000000"/>
+          <w:kern w:val="0"/>
+          <w14:ligatures w14:val="none"/>
+        </w:rPr>
+        <w:t>Do these linguistic differences correspond to structural clustering in the channel network?</w:t>
+      </w:r>
+      <w:r>
+        <w:rPr>
+          <w:rFonts w:ascii="Times New Roman" w:eastAsia="Times New Roman" w:hAnsi="Times New Roman" w:cs="Times New Roman"/>
+          <w:i/>
+          <w:iCs/>
+          <w:color w:val="000000"/>
+          <w:kern w:val="0"/>
+          <w14:ligatures w14:val="none"/>
+        </w:rPr>
+        <w:br/>
+      </w:r>
+      <w:r>
+        <w:rPr>
+          <w:rFonts w:ascii="Times New Roman" w:eastAsia="Times New Roman" w:hAnsi="Times New Roman" w:cs="Times New Roman"/>
+          <w:color w:val="000000"/>
+          <w:kern w:val="0"/>
+          <w14:ligatures w14:val="none"/>
+        </w:rPr>
+        <w:t>This question investigates whether channels that are linguistically similar are also structurally connected, forming ideologically cohesive communities within the network.</w:t>
+      </w:r>
+    </w:p>
+    <w:p>
+      <w:pPr>
+        <w:spacing w:before="240" w:after="240" w:line="240" w:lineRule="auto"/>
+        <w:rPr>
+          <w:rFonts w:ascii="Times New Roman" w:eastAsia="Times New Roman" w:hAnsi="Times New Roman" w:cs="Times New Roman"/>
+          <w:kern w:val="0"/>
+          <w14:ligatures w14:val="none"/>
+        </w:rPr>
+      </w:pPr>
+      <w:r>
+        <w:rPr>
+          <w:rFonts w:ascii="Times New Roman" w:eastAsia="Times New Roman" w:hAnsi="Times New Roman" w:cs="Times New Roman"/>
+          <w:color w:val="000000"/>
+          <w:kern w:val="0"/>
+          <w14:ligatures w14:val="none"/>
+        </w:rPr>
+        <w:t>Together, these questions aim to assess whether differences in discourse are not only observable at the level of language but also reinforced through network-level organization, providing a more comprehensive understanding of political polarization in online video platforms.</w:t>
+      </w:r>
+    </w:p>
+    <w:p>
+      <w:pPr>
+        <w:spacing w:after="0" w:line="240" w:lineRule="auto"/>
+        <w:rPr>
+          <w:rFonts w:ascii="Times New Roman" w:eastAsia="Times New Roman" w:hAnsi="Times New Roman" w:cs="Times New Roman"/>
+          <w:kern w:val="0"/>
+          <w14:ligatures w14:val="none"/>
+        </w:rPr>
+      </w:pPr>
+    </w:p>
+    <w:p>
+      <w:pPr>
+        <w:spacing w:line="240" w:lineRule="auto"/>
+        <w:rPr>
+          <w:rFonts w:ascii="Times New Roman" w:eastAsia="Times New Roman" w:hAnsi="Times New Roman" w:cs="Times New Roman"/>
+          <w:kern w:val="0"/>
+          <w14:ligatures w14:val="none"/>
+        </w:rPr>
+      </w:pPr>
+      <w:r>
+        <w:rPr>
+          <w:rFonts w:ascii="Times New Roman" w:eastAsia="Times New Roman" w:hAnsi="Times New Roman" w:cs="Times New Roman"/>
           <w:b/>
           <w:bCs/>
+          <w:color w:val="000000"/>
+          <w:kern w:val="0"/>
+          <w14:ligatures w14:val="none"/>
         </w:rPr>
         <w:t>Data Collection</w:t>
       </w:r>
     </w:p>
     <w:p>
       <w:pPr>
-        <w:pStyle w:val="isselectedend"/>
-      </w:pPr>
-      <w:r>
-        <w:t>Data for this study were collected using the YouTube Data API v3, which provides access to publicly available information about videos, channels, and related metadata. The data collection process was designed to obtain a diverse set of political content from YouTube channels with varying ideological orientations.</w:t>
-      </w:r>
-    </w:p>
-    <w:p>
-      <w:pPr>
-        <w:pStyle w:val="NormalWeb"/>
-      </w:pPr>
-      <w:r>
-        <w:t>First, a set of search queries was defined to identify relevant political channels. To ensure a diverse and comprehensive collection of channels, multiple query terms were iteratively tested and refined in order to capture a wide range of political perspectives and content styles. The final set of queries included: “political commentary US,” “right wing politics,” “US news,” “liberal news,” “progressive politics US,” “liberal political commentary,” “left wing politics US,” “progressive panel discussion,” and “democrat debate panel.”</w:t>
-      </w:r>
-    </w:p>
-    <w:p>
-      <w:pPr>
-        <w:pStyle w:val="NormalWeb"/>
-      </w:pPr>
-      <w:r>
-        <w:t>For each query, the YouTube search endpoint was used to retrieve the top 50 associated channels. The results from all queries were then combined, and duplicate entries were removed to ensure a unique set of candidate channels, and 398 channels were left finally. This multi-query approach was adopted to reduce potential bias introduced by the platform’s search algorithm and to improve the diversity of the collected channels.</w:t>
-      </w:r>
-    </w:p>
-    <w:p>
-      <w:pPr>
-        <w:pStyle w:val="NormalWeb"/>
-      </w:pPr>
-      <w:r>
-        <w:t>Second, channel-level information was retrieved to refine the selection. In particular, subscriber counts were collected using the YouTube channels endpoint, and only channels exceeding one million were retained, which resulted in 27 channels at the end. This step ensured that the analysis focused on influential channels with a substantial audience reach.</w:t>
-      </w:r>
-    </w:p>
-    <w:p>
-      <w:pPr>
-        <w:pStyle w:val="isselectedend"/>
-      </w:pPr>
-      <w:r>
-        <w:t xml:space="preserve">Following this, each selected channel was manually labeled according to its ideological orientation as either progressive (left) or conservative (right), based on its content and public </w:t>
-      </w:r>
-      <w:r>
-        <w:lastRenderedPageBreak/>
-        <w:t>positioning. This manual coding step enabled the construction of two distinct groups for comparative analysis.</w:t>
-      </w:r>
-    </w:p>
-    <w:p>
-      <w:pPr>
-        <w:pStyle w:val="NormalWeb"/>
-      </w:pPr>
-      <w:r>
-        <w:t>After applying the selection criteria and filtering steps, a final set of six channels remained, consisting of 5 progressive (left-leaning) and 6 conservative (right-leaning) channels. This balanced selection ensured comparability between the two ideological groups</w:t>
-      </w:r>
-    </w:p>
-    <w:p>
-      <w:pPr>
-        <w:pStyle w:val="NormalWeb"/>
-      </w:pPr>
-      <w:r>
-        <w:t>Finally, video-level data were collected from the selected channels. For each channel, the 50 most recent videos were retrieved via the YouTube API, and relevant metadata—including video titles, descriptions, and publication dates—were extracted. In total, the dataset consists of 352 videos, with 197 from left-leaning channels and 155 from right-leaning channels.To ensure a meaningful comparison across ideological groups, the dataset was restricted to videos related to a common political topic. Specifically, only videos containing the keyword “Trump or donald trump or president” in their title or description were retained. This filtering step was introduced to control for topic variation, as differences in language use may otherwise reflect differences in subject matter rather than ideological framing. After applying this step, 133 videos were obtained, with 106 left-leaning channels and 27 right-leaning channels.</w:t>
-      </w:r>
-    </w:p>
-    <w:p>
-      <w:pPr>
-        <w:pStyle w:val="NormalWeb"/>
-      </w:pPr>
-      <w:r>
-        <w:t>By focusing on a shared issue, the analysis aims to isolate linguistic and emotional differences attributable to ideological perspectives, rather than confounding them with variations across unrelated topics. This approach strengthens the validity of the comparison by ensuring that both progressive and conservative channels are examined within a consistent thematic context.</w:t>
-      </w:r>
-    </w:p>
-    <w:p>
-      <w:pPr>
-        <w:pStyle w:val="NormalWeb"/>
-      </w:pPr>
-      <w:r>
-        <w:t>In addition, user-generated comments were collected for each selected video to capture audience-level discourse. For each video, up to 30 top-level comments were retrieved based on relevance ranking using the YouTube API. This step enabled the inclusion of more representative and context-rich textual data, extending the analysis beyond channel-produced content to incorporate user perspectives.</w:t>
-      </w:r>
-    </w:p>
-    <w:p>
-      <w:pPr>
-        <w:rPr>
-          <w:rFonts w:ascii="Times New Roman" w:eastAsia="Times New Roman" w:hAnsi="Times New Roman" w:cs="Times New Roman"/>
-          <w:kern w:val="0"/>
-          <w:lang w:val="en-US"/>
-          <w14:ligatures w14:val="none"/>
-        </w:rPr>
-      </w:pPr>
-      <w:r>
-        <w:rPr>
-          <w:rFonts w:ascii="Times New Roman" w:eastAsia="Times New Roman" w:hAnsi="Times New Roman" w:cs="Times New Roman"/>
-          <w:kern w:val="0"/>
-          <w14:ligatures w14:val="none"/>
-        </w:rPr>
-        <w:t>The final dataset therefore consists of video metadata and associated user comments centered on a shared political topic, forming the basis for subsequent linguistic, sentiment, and network analyses.</w:t>
-      </w:r>
-    </w:p>
-    <w:p>
-      <w:pPr>
-        <w:rPr>
-          <w:rFonts w:ascii="Times New Roman" w:hAnsi="Times New Roman" w:cs="Times New Roman"/>
+        <w:spacing w:before="240" w:after="240" w:line="240" w:lineRule="auto"/>
+        <w:rPr>
+          <w:rFonts w:ascii="Times New Roman" w:eastAsia="Times New Roman" w:hAnsi="Times New Roman" w:cs="Times New Roman"/>
+          <w:kern w:val="0"/>
+          <w14:ligatures w14:val="none"/>
+        </w:rPr>
+      </w:pPr>
+      <w:r>
+        <w:rPr>
+          <w:rFonts w:ascii="Times New Roman" w:eastAsia="Times New Roman" w:hAnsi="Times New Roman" w:cs="Times New Roman"/>
+          <w:color w:val="000000"/>
+          <w:kern w:val="0"/>
+          <w14:ligatures w14:val="none"/>
+        </w:rPr>
+        <w:t>This study constructs a dataset of political content on YouTube using the YouTube Data API v3. The data collection process was guided by two principles: ensuring ideological diversity and enabling controlled comparison through a shared political topic.</w:t>
+      </w:r>
+    </w:p>
+    <w:p>
+      <w:pPr>
+        <w:spacing w:before="240" w:after="240" w:line="240" w:lineRule="auto"/>
+        <w:rPr>
+          <w:rFonts w:ascii="Times New Roman" w:eastAsia="Times New Roman" w:hAnsi="Times New Roman" w:cs="Times New Roman"/>
+          <w:kern w:val="0"/>
+          <w14:ligatures w14:val="none"/>
+        </w:rPr>
+      </w:pPr>
+      <w:r>
+        <w:rPr>
+          <w:rFonts w:ascii="Times New Roman" w:eastAsia="Times New Roman" w:hAnsi="Times New Roman" w:cs="Times New Roman"/>
+          <w:color w:val="000000"/>
+          <w:kern w:val="0"/>
+          <w14:ligatures w14:val="none"/>
+        </w:rPr>
+        <w:t>To identify relevant channels, a multi-query search strategy was used, combining results from multiple political search terms (e.g., “political commentary US,” “right wing politics,” “liberal news”). The top 50 channels per query were retrieved and deduplicated, yielding 398 unique channels. To focus on influential content, only channels with more than one million subscribers were retained, resulting in 27 channels.</w:t>
+      </w:r>
+    </w:p>
+    <w:p>
+      <w:pPr>
+        <w:spacing w:before="240" w:after="240" w:line="240" w:lineRule="auto"/>
+        <w:rPr>
+          <w:rFonts w:ascii="Times New Roman" w:eastAsia="Times New Roman" w:hAnsi="Times New Roman" w:cs="Times New Roman"/>
+          <w:kern w:val="0"/>
+          <w14:ligatures w14:val="none"/>
+        </w:rPr>
+      </w:pPr>
+      <w:r>
+        <w:rPr>
+          <w:rFonts w:ascii="Times New Roman" w:eastAsia="Times New Roman" w:hAnsi="Times New Roman" w:cs="Times New Roman"/>
+          <w:color w:val="000000"/>
+          <w:kern w:val="0"/>
+          <w14:ligatures w14:val="none"/>
+        </w:rPr>
+        <w:t>Channels were manually labeled as progressive or conservative based on their content and positioning. To ensure clear ideological distinction, channels with ambiguous orientations were excluded, leaving a final set of six channels (three per group).</w:t>
+      </w:r>
+    </w:p>
+    <w:p>
+      <w:pPr>
+        <w:spacing w:before="240" w:after="240" w:line="240" w:lineRule="auto"/>
+        <w:rPr>
+          <w:rFonts w:ascii="Times New Roman" w:eastAsia="Times New Roman" w:hAnsi="Times New Roman" w:cs="Times New Roman"/>
+          <w:kern w:val="0"/>
+          <w14:ligatures w14:val="none"/>
+        </w:rPr>
+      </w:pPr>
+      <w:r>
+        <w:rPr>
+          <w:rFonts w:ascii="Times New Roman" w:eastAsia="Times New Roman" w:hAnsi="Times New Roman" w:cs="Times New Roman"/>
+          <w:color w:val="000000"/>
+          <w:kern w:val="0"/>
+          <w14:ligatures w14:val="none"/>
+        </w:rPr>
+        <w:t>For each channel, the 50 most recent videos were collected. To control for topic variation, only videos containing keywords such as “Trump,” “Donald Trump,” or “President” were retained.</w:t>
+      </w:r>
+    </w:p>
+    <w:p>
+      <w:pPr>
+        <w:spacing w:before="240" w:after="240" w:line="240" w:lineRule="auto"/>
+        <w:rPr>
+          <w:rFonts w:ascii="Times New Roman" w:eastAsia="Times New Roman" w:hAnsi="Times New Roman" w:cs="Times New Roman"/>
+          <w:kern w:val="0"/>
+          <w14:ligatures w14:val="none"/>
+        </w:rPr>
+      </w:pPr>
+      <w:r>
+        <w:rPr>
+          <w:rFonts w:ascii="Times New Roman" w:eastAsia="Times New Roman" w:hAnsi="Times New Roman" w:cs="Times New Roman"/>
+          <w:color w:val="000000"/>
+          <w:kern w:val="0"/>
+          <w14:ligatures w14:val="none"/>
+        </w:rPr>
+        <w:t>Initially, video descriptions were included, but were removed due to repetitive and non-informative content. Instead, user-generated comments were incorporated to capture audience-level discourse. For each video, up to 30 top-level comments were collected based on relevance ranking.</w:t>
+      </w:r>
+    </w:p>
+    <w:p>
+      <w:pPr>
+        <w:spacing w:before="240" w:after="240" w:line="240" w:lineRule="auto"/>
+        <w:rPr>
+          <w:rFonts w:ascii="Times New Roman" w:eastAsia="Times New Roman" w:hAnsi="Times New Roman" w:cs="Times New Roman"/>
+          <w:kern w:val="0"/>
+          <w14:ligatures w14:val="none"/>
+        </w:rPr>
+      </w:pPr>
+      <w:r>
+        <w:rPr>
+          <w:rFonts w:ascii="Times New Roman" w:eastAsia="Times New Roman" w:hAnsi="Times New Roman" w:cs="Times New Roman"/>
+          <w:color w:val="000000"/>
+          <w:kern w:val="0"/>
+          <w14:ligatures w14:val="none"/>
+        </w:rPr>
+        <w:t>The final dataset consists of video titles and associated comments from ideologically distinct channels within a shared topic, enabling analysis of linguistic patterns while minimizing topic-related confounding effects.</w:t>
+      </w:r>
+    </w:p>
+    <w:p>
+      <w:pPr>
+        <w:spacing w:after="0" w:line="240" w:lineRule="auto"/>
+        <w:rPr>
+          <w:rFonts w:ascii="Times New Roman" w:eastAsia="Times New Roman" w:hAnsi="Times New Roman" w:cs="Times New Roman"/>
+          <w:kern w:val="0"/>
+          <w14:ligatures w14:val="none"/>
+        </w:rPr>
+      </w:pPr>
+    </w:p>
+    <w:p>
+      <w:pPr>
+        <w:spacing w:before="240" w:after="240" w:line="240" w:lineRule="auto"/>
+        <w:rPr>
+          <w:rFonts w:ascii="Times New Roman" w:eastAsia="Times New Roman" w:hAnsi="Times New Roman" w:cs="Times New Roman"/>
+          <w:kern w:val="0"/>
+          <w14:ligatures w14:val="none"/>
+        </w:rPr>
+      </w:pPr>
+      <w:r>
+        <w:rPr>
+          <w:rFonts w:ascii="Times New Roman" w:eastAsia="Times New Roman" w:hAnsi="Times New Roman" w:cs="Times New Roman"/>
           <w:b/>
           <w:bCs/>
-        </w:rPr>
-      </w:pPr>
-      <w:r>
-        <w:rPr>
-          <w:rFonts w:ascii="Times New Roman" w:hAnsi="Times New Roman" w:cs="Times New Roman"/>
+          <w:color w:val="000000"/>
+          <w:kern w:val="0"/>
+          <w14:ligatures w14:val="none"/>
+        </w:rPr>
+        <w:t>Data Preprocessing</w:t>
+      </w:r>
+    </w:p>
+    <w:p>
+      <w:pPr>
+        <w:spacing w:before="240" w:after="240" w:line="240" w:lineRule="auto"/>
+        <w:rPr>
+          <w:rFonts w:ascii="Times New Roman" w:eastAsia="Times New Roman" w:hAnsi="Times New Roman" w:cs="Times New Roman"/>
+          <w:kern w:val="0"/>
+          <w14:ligatures w14:val="none"/>
+        </w:rPr>
+      </w:pPr>
+      <w:r>
+        <w:rPr>
+          <w:rFonts w:ascii="Times New Roman" w:eastAsia="Times New Roman" w:hAnsi="Times New Roman" w:cs="Times New Roman"/>
+          <w:color w:val="000000"/>
+          <w:kern w:val="0"/>
+          <w14:ligatures w14:val="none"/>
+        </w:rPr>
+        <w:t>The collected textual data were preprocessed to ensure consistency and suitability for downstream linguistic analysis. All text data, including video titles and user comments, were first converted to lowercase and cleaned by removing punctuation, numerical values, and non-alphabetic characters.</w:t>
+      </w:r>
+    </w:p>
+    <w:p>
+      <w:pPr>
+        <w:spacing w:before="240" w:after="240" w:line="240" w:lineRule="auto"/>
+        <w:rPr>
+          <w:rFonts w:ascii="Times New Roman" w:eastAsia="Times New Roman" w:hAnsi="Times New Roman" w:cs="Times New Roman"/>
+          <w:kern w:val="0"/>
+          <w14:ligatures w14:val="none"/>
+        </w:rPr>
+      </w:pPr>
+      <w:r>
+        <w:rPr>
+          <w:rFonts w:ascii="Times New Roman" w:eastAsia="Times New Roman" w:hAnsi="Times New Roman" w:cs="Times New Roman"/>
+          <w:color w:val="000000"/>
+          <w:kern w:val="0"/>
+          <w14:ligatures w14:val="none"/>
+        </w:rPr>
+        <w:t>The cleaned text was then tokenized into word-level units. To focus on meaningful linguistic patterns, common stopwords were removed using both standard stopword lists and a custom-defined set tailored to the dataset. The custom stopwords included platform-specific and non-informative terms (e.g., “subscribe,” “channel,” “video”) as well as frequently occurring proper names that do not contribute to distinguishing ideological content.</w:t>
+      </w:r>
+    </w:p>
+    <w:p>
+      <w:pPr>
+        <w:spacing w:before="240" w:after="240" w:line="240" w:lineRule="auto"/>
+        <w:rPr>
+          <w:rFonts w:ascii="Times New Roman" w:eastAsia="Times New Roman" w:hAnsi="Times New Roman" w:cs="Times New Roman"/>
+          <w:kern w:val="0"/>
+          <w14:ligatures w14:val="none"/>
+        </w:rPr>
+      </w:pPr>
+      <w:r>
+        <w:rPr>
+          <w:rFonts w:ascii="Times New Roman" w:eastAsia="Times New Roman" w:hAnsi="Times New Roman" w:cs="Times New Roman"/>
+          <w:color w:val="000000"/>
+          <w:kern w:val="0"/>
+          <w14:ligatures w14:val="none"/>
+        </w:rPr>
+        <w:t xml:space="preserve">To further capture contextual relationships between words, bigram features were constructed by combining adjacent tokens. During this process, bigrams containing stopwords or non-informative terms were filtered out to retain only meaningful word combinations. This allows the </w:t>
+      </w:r>
+      <w:r>
+        <w:rPr>
+          <w:rFonts w:ascii="Times New Roman" w:eastAsia="Times New Roman" w:hAnsi="Times New Roman" w:cs="Times New Roman"/>
+          <w:color w:val="000000"/>
+          <w:kern w:val="0"/>
+          <w14:ligatures w14:val="none"/>
+        </w:rPr>
+        <w:lastRenderedPageBreak/>
+        <w:t>analysis to identify recurring phrases and framing patterns that may not be observable at the unigram level.</w:t>
+      </w:r>
+    </w:p>
+    <w:p>
+      <w:pPr>
+        <w:spacing w:before="240" w:after="240" w:line="240" w:lineRule="auto"/>
+        <w:rPr>
+          <w:rFonts w:ascii="Times New Roman" w:eastAsia="Times New Roman" w:hAnsi="Times New Roman" w:cs="Times New Roman"/>
+          <w:kern w:val="0"/>
+          <w14:ligatures w14:val="none"/>
+        </w:rPr>
+      </w:pPr>
+      <w:r>
+        <w:rPr>
+          <w:rFonts w:ascii="Times New Roman" w:eastAsia="Times New Roman" w:hAnsi="Times New Roman" w:cs="Times New Roman"/>
+          <w:color w:val="000000"/>
+          <w:kern w:val="0"/>
+          <w14:ligatures w14:val="none"/>
+        </w:rPr>
+        <w:t>In addition, infrequent tokens were removed by applying a minimum frequency threshold across the dataset, reducing noise and improving the stability of subsequent statistical measures such as TF-IDF.</w:t>
+      </w:r>
+    </w:p>
+    <w:p>
+      <w:pPr>
+        <w:spacing w:before="240" w:after="240" w:line="240" w:lineRule="auto"/>
+        <w:rPr>
+          <w:rFonts w:ascii="Times New Roman" w:eastAsia="Times New Roman" w:hAnsi="Times New Roman" w:cs="Times New Roman"/>
+          <w:kern w:val="0"/>
+          <w14:ligatures w14:val="none"/>
+        </w:rPr>
+      </w:pPr>
+      <w:r>
+        <w:rPr>
+          <w:rFonts w:ascii="Times New Roman" w:eastAsia="Times New Roman" w:hAnsi="Times New Roman" w:cs="Times New Roman"/>
+          <w:color w:val="000000"/>
+          <w:kern w:val="0"/>
+          <w14:ligatures w14:val="none"/>
+        </w:rPr>
+        <w:t>Following preprocessing, the text was aggregated at the channel level, where all titles and associated comments for each channel were combined into a single document. This representation enables the analysis to capture the overall linguistic and framing characteristics of each channel, rather than focusing on individual videos in isolation.</w:t>
+      </w:r>
+    </w:p>
+    <w:p>
+      <w:pPr>
+        <w:spacing w:after="0" w:line="240" w:lineRule="auto"/>
+        <w:rPr>
+          <w:rFonts w:ascii="Times New Roman" w:eastAsia="Times New Roman" w:hAnsi="Times New Roman" w:cs="Times New Roman"/>
+          <w:kern w:val="0"/>
+          <w14:ligatures w14:val="none"/>
+        </w:rPr>
+      </w:pPr>
+    </w:p>
+    <w:p>
+      <w:pPr>
+        <w:spacing w:before="100" w:beforeAutospacing="1" w:after="100" w:afterAutospacing="1" w:line="240" w:lineRule="auto"/>
+        <w:outlineLvl w:val="1"/>
+        <w:rPr>
+          <w:rFonts w:ascii="Times New Roman" w:eastAsia="Times New Roman" w:hAnsi="Times New Roman" w:cs="Times New Roman"/>
           <w:b/>
           <w:bCs/>
-        </w:rPr>
-        <w:t xml:space="preserve">Data Preprocessing </w:t>
-      </w:r>
-    </w:p>
-    <w:p>
-      <w:pPr>
-        <w:pStyle w:val="isselectedend"/>
-      </w:pPr>
-      <w:r>
-        <w:t>Prior to analysis, the collected textual data were subjected to a series of preprocessing steps to improve data quality and reduce noise. Initially, the dataset consisted of video titles and descriptions. However, during exploratory analysis, it was observed that video descriptions frequently contained non-informative and repetitive content, such as promotional text, hyperlinks, and subscription prompts, which introduced substantial noise into the analysis.</w:t>
-      </w:r>
-    </w:p>
-    <w:p>
-      <w:pPr>
-        <w:pStyle w:val="NormalWeb"/>
-      </w:pPr>
-      <w:r>
-        <w:t>As a result, the analysis approach was revised. Video descriptions were excluded from the dataset, and user-generated comments were subsequently collected and incorporated instead. Compared to descriptions, comments were found to better reflect authentic audience discourse and provided more meaningful linguistic signals relevant to political communication. Consequently, the final analysis was conducted using video titles and associated user comments.</w:t>
-      </w:r>
-    </w:p>
-    <w:p>
-      <w:pPr>
-        <w:pStyle w:val="isselectedend"/>
-      </w:pPr>
-      <w:r>
+          <w:kern w:val="0"/>
+          <w14:ligatures w14:val="none"/>
+        </w:rPr>
+      </w:pPr>
+      <w:r>
+        <w:rPr>
+          <w:rFonts w:ascii="Times New Roman" w:eastAsia="Times New Roman" w:hAnsi="Times New Roman" w:cs="Times New Roman"/>
+          <w:b/>
+          <w:bCs/>
+          <w:kern w:val="0"/>
+          <w14:ligatures w14:val="none"/>
+        </w:rPr>
+        <w:t>5. Methodology</w:t>
+      </w:r>
+    </w:p>
+    <w:p>
+      <w:pPr>
+        <w:spacing w:before="100" w:beforeAutospacing="1" w:after="100" w:afterAutospacing="1" w:line="240" w:lineRule="auto"/>
+        <w:rPr>
+          <w:rFonts w:ascii="Times New Roman" w:eastAsia="Times New Roman" w:hAnsi="Times New Roman" w:cs="Times New Roman"/>
+          <w:kern w:val="0"/>
+          <w14:ligatures w14:val="none"/>
+        </w:rPr>
+      </w:pPr>
+      <w:r>
+        <w:rPr>
+          <w:rFonts w:ascii="Times New Roman" w:eastAsia="Times New Roman" w:hAnsi="Times New Roman" w:cs="Times New Roman"/>
+          <w:kern w:val="0"/>
+          <w14:ligatures w14:val="none"/>
+        </w:rPr>
+        <w:t>This study employs a combined linguistic and network-based framework to examine political polarization in YouTube discourse. By integrating textual analysis with network modeling, the methodology captures both how content is expressed and how channels are structurally related.</w:t>
+      </w:r>
+      <w:r>
+        <w:rPr>
+          <w:rFonts w:ascii="Times New Roman" w:eastAsia="Times New Roman" w:hAnsi="Times New Roman" w:cs="Times New Roman"/>
+          <w:kern w:val="0"/>
+          <w14:ligatures w14:val="none"/>
+        </w:rPr>
+        <w:t>a</w:t>
+      </w:r>
+    </w:p>
+    <w:p>
+      <w:pPr>
+        <w:spacing w:before="100" w:beforeAutospacing="1" w:after="100" w:afterAutospacing="1" w:line="240" w:lineRule="auto"/>
+        <w:outlineLvl w:val="2"/>
+        <w:rPr>
+          <w:rFonts w:ascii="Times New Roman" w:eastAsia="Times New Roman" w:hAnsi="Times New Roman" w:cs="Times New Roman"/>
+          <w:b/>
+          <w:bCs/>
+          <w:kern w:val="0"/>
+          <w14:ligatures w14:val="none"/>
+        </w:rPr>
+      </w:pPr>
+      <w:r>
+        <w:rPr>
+          <w:rFonts w:ascii="Times New Roman" w:eastAsia="Times New Roman" w:hAnsi="Times New Roman" w:cs="Times New Roman"/>
+          <w:b/>
+          <w:bCs/>
+          <w:kern w:val="0"/>
+          <w14:ligatures w14:val="none"/>
+        </w:rPr>
+        <w:t>5.1 Linguistic Analysis</w:t>
+      </w:r>
+    </w:p>
+    <w:p>
+      <w:pPr>
+        <w:spacing w:before="100" w:beforeAutospacing="1" w:after="100" w:afterAutospacing="1" w:line="240" w:lineRule="auto"/>
+        <w:rPr>
+          <w:rFonts w:ascii="Times New Roman" w:eastAsia="Times New Roman" w:hAnsi="Times New Roman" w:cs="Times New Roman"/>
+          <w:kern w:val="0"/>
+          <w14:ligatures w14:val="none"/>
+        </w:rPr>
+      </w:pPr>
+      <w:r>
+        <w:rPr>
+          <w:rFonts w:ascii="Times New Roman" w:eastAsia="Times New Roman" w:hAnsi="Times New Roman" w:cs="Times New Roman"/>
+          <w:kern w:val="0"/>
+          <w14:ligatures w14:val="none"/>
+        </w:rPr>
+        <w:t>To examine differences in language use across ideological groups, this study applies TF-IDF, bigram analysis, and sentiment analysis.</w:t>
+      </w:r>
+    </w:p>
+    <w:p>
+      <w:pPr>
+        <w:spacing w:before="100" w:beforeAutospacing="1" w:after="100" w:afterAutospacing="1" w:line="240" w:lineRule="auto"/>
+        <w:rPr>
+          <w:rFonts w:ascii="Times New Roman" w:eastAsia="Times New Roman" w:hAnsi="Times New Roman" w:cs="Times New Roman"/>
+          <w:kern w:val="0"/>
+          <w14:ligatures w14:val="none"/>
+        </w:rPr>
+      </w:pPr>
+      <w:r>
+        <w:rPr>
+          <w:rFonts w:ascii="Times New Roman" w:eastAsia="Times New Roman" w:hAnsi="Times New Roman" w:cs="Times New Roman"/>
+          <w:kern w:val="0"/>
+          <w14:ligatures w14:val="none"/>
+        </w:rPr>
+        <w:t>TF-IDF is used to identify distinctive terms for each group by emphasizing relatively unique words while down-weighting common ones, enabling detection of differences in vocabulary and framing. Bigram analysis captures recurring word pairings, allowing the identification of phrase-level patterns that better reflect how meaning is constructed in political discourse. Sentiment analysis, based on a lexicon approach, measures differences in emotional tone by comparing positive and negative word usage across groups.</w:t>
+      </w:r>
+    </w:p>
+    <w:p>
+      <w:pPr>
+        <w:spacing w:before="100" w:beforeAutospacing="1" w:after="100" w:afterAutospacing="1" w:line="240" w:lineRule="auto"/>
+        <w:rPr>
+          <w:rFonts w:ascii="Times New Roman" w:eastAsia="Times New Roman" w:hAnsi="Times New Roman" w:cs="Times New Roman"/>
+          <w:kern w:val="0"/>
+          <w14:ligatures w14:val="none"/>
+        </w:rPr>
+      </w:pPr>
+      <w:r>
+        <w:rPr>
+          <w:rFonts w:ascii="Times New Roman" w:eastAsia="Times New Roman" w:hAnsi="Times New Roman" w:cs="Times New Roman"/>
+          <w:kern w:val="0"/>
+          <w14:ligatures w14:val="none"/>
+        </w:rPr>
+        <w:t>Together, these methods capture linguistic variation at the levels of vocabulary, framing, and emotion.</w:t>
+      </w:r>
+    </w:p>
+    <w:p>
+      <w:pPr>
+        <w:spacing w:before="100" w:beforeAutospacing="1" w:after="100" w:afterAutospacing="1" w:line="240" w:lineRule="auto"/>
+        <w:outlineLvl w:val="2"/>
+        <w:rPr>
+          <w:rFonts w:ascii="Times New Roman" w:eastAsia="Times New Roman" w:hAnsi="Times New Roman" w:cs="Times New Roman"/>
+          <w:b/>
+          <w:bCs/>
+          <w:kern w:val="0"/>
+          <w14:ligatures w14:val="none"/>
+        </w:rPr>
+      </w:pPr>
+      <w:r>
+        <w:rPr>
+          <w:rFonts w:ascii="Times New Roman" w:eastAsia="Times New Roman" w:hAnsi="Times New Roman" w:cs="Times New Roman"/>
+          <w:b/>
+          <w:bCs/>
+          <w:kern w:val="0"/>
+          <w14:ligatures w14:val="none"/>
+        </w:rPr>
+        <w:t>5.2 Network Analysis</w:t>
+      </w:r>
+    </w:p>
+    <w:p>
+      <w:pPr>
+        <w:spacing w:before="100" w:beforeAutospacing="1" w:after="100" w:afterAutospacing="1" w:line="240" w:lineRule="auto"/>
+        <w:rPr>
+          <w:rFonts w:ascii="Times New Roman" w:eastAsia="Times New Roman" w:hAnsi="Times New Roman" w:cs="Times New Roman"/>
+          <w:kern w:val="0"/>
+          <w14:ligatures w14:val="none"/>
+        </w:rPr>
+      </w:pPr>
+      <w:r>
+        <w:rPr>
+          <w:rFonts w:ascii="Times New Roman" w:eastAsia="Times New Roman" w:hAnsi="Times New Roman" w:cs="Times New Roman"/>
+          <w:kern w:val="0"/>
+          <w14:ligatures w14:val="none"/>
+        </w:rPr>
+        <w:t>To complement the linguistic analysis, a similarity-based network is constructed in which channels are represented as nodes and edges are defined by cosine similarity of their textual content. This network reflects linguistic proximity between channels.</w:t>
+      </w:r>
+    </w:p>
+    <w:p>
+      <w:pPr>
+        <w:spacing w:before="100" w:beforeAutospacing="1" w:after="100" w:afterAutospacing="1" w:line="240" w:lineRule="auto"/>
+        <w:rPr>
+          <w:rFonts w:ascii="Times New Roman" w:eastAsia="Times New Roman" w:hAnsi="Times New Roman" w:cs="Times New Roman"/>
+          <w:kern w:val="0"/>
+          <w14:ligatures w14:val="none"/>
+        </w:rPr>
+      </w:pPr>
+      <w:r>
+        <w:rPr>
+          <w:rFonts w:ascii="Times New Roman" w:eastAsia="Times New Roman" w:hAnsi="Times New Roman" w:cs="Times New Roman"/>
+          <w:kern w:val="0"/>
+          <w14:ligatures w14:val="none"/>
+        </w:rPr>
+        <w:t>Community structure is examined using the Louvain algorithm, which identifies clusters by maximizing modularity. In addition, ideological assortativity is computed to assess whether channels are more likely to connect with others sharing the same ideological label.</w:t>
+      </w:r>
+    </w:p>
+    <w:p>
+      <w:pPr>
+        <w:spacing w:before="100" w:beforeAutospacing="1" w:after="100" w:afterAutospacing="1" w:line="240" w:lineRule="auto"/>
+        <w:outlineLvl w:val="2"/>
+        <w:rPr>
+          <w:rFonts w:ascii="Times New Roman" w:eastAsia="Times New Roman" w:hAnsi="Times New Roman" w:cs="Times New Roman"/>
+          <w:b/>
+          <w:bCs/>
+          <w:kern w:val="0"/>
+          <w14:ligatures w14:val="none"/>
+        </w:rPr>
+      </w:pPr>
+      <w:r>
+        <w:rPr>
+          <w:rFonts w:ascii="Times New Roman" w:eastAsia="Times New Roman" w:hAnsi="Times New Roman" w:cs="Times New Roman"/>
+          <w:b/>
+          <w:bCs/>
+          <w:kern w:val="0"/>
+          <w14:ligatures w14:val="none"/>
+        </w:rPr>
+        <w:t>5.3 Integrating Linguistic and Network Perspectives</w:t>
+      </w:r>
+    </w:p>
+    <w:p>
+      <w:pPr>
+        <w:spacing w:before="100" w:beforeAutospacing="1" w:after="100" w:afterAutospacing="1" w:line="240" w:lineRule="auto"/>
+        <w:rPr>
+          <w:rFonts w:ascii="Times New Roman" w:eastAsia="Times New Roman" w:hAnsi="Times New Roman" w:cs="Times New Roman"/>
+          <w:kern w:val="0"/>
+          <w14:ligatures w14:val="none"/>
+        </w:rPr>
+      </w:pPr>
+      <w:r>
+        <w:rPr>
+          <w:rFonts w:ascii="Times New Roman" w:eastAsia="Times New Roman" w:hAnsi="Times New Roman" w:cs="Times New Roman"/>
+          <w:kern w:val="0"/>
+          <w14:ligatures w14:val="none"/>
+        </w:rPr>
         <w:lastRenderedPageBreak/>
-        <w:t>Following this adjustment, standard text preprocessing techniques were applied. The text was tokenized into individual words, and common stopwords (e.g., “the,” “and,” “is”) were removed using a predefined stopword list. In addition, a custom set of stopwords was constructed to eliminate platform-specific terms such as “subscribe,” “channel,” and “link,” which were frequently observed but did not carry substantive meaning.</w:t>
-      </w:r>
-    </w:p>
-    <w:p>
-      <w:pPr>
-        <w:pStyle w:val="NormalWeb"/>
-      </w:pPr>
-      <w:r>
-        <w:t>Further cleaning steps included the removal of numerical tokens and non-alphabetic strings, as well as filtering out frequently occurring proper names that were not analytically meaningful. These preprocessing steps ensured that the remaining vocabulary more accurately captured meaningful political language, thereby improving the reliability and interpretability of the subsequent linguistic and sentiment analyses.</w:t>
-      </w:r>
-    </w:p>
-    <w:p>
-      <w:pPr>
-        <w:rPr>
-          <w:rFonts w:ascii="Times New Roman" w:hAnsi="Times New Roman" w:cs="Times New Roman"/>
-        </w:rPr>
-      </w:pPr>
+        <w:t>Finally, linguistic patterns are linked to network structure by examining whether channels with similar language use are also structurally grouped. This integrated approach enables the study to assess polarization at both the level of discourse and network organization.</w:t>
+      </w:r>
+    </w:p>
+    <w:p>
+      <w:pPr>
+        <w:spacing w:before="360" w:after="80" w:line="240" w:lineRule="auto"/>
+        <w:outlineLvl w:val="1"/>
+        <w:rPr>
+          <w:rFonts w:ascii="Times New Roman" w:eastAsia="Times New Roman" w:hAnsi="Times New Roman" w:cs="Times New Roman"/>
+          <w:b/>
+          <w:bCs/>
+          <w:kern w:val="0"/>
+          <w14:ligatures w14:val="none"/>
+        </w:rPr>
+      </w:pPr>
+      <w:r>
+        <w:rPr>
+          <w:rFonts w:ascii="Times New Roman" w:eastAsia="Times New Roman" w:hAnsi="Times New Roman" w:cs="Times New Roman"/>
+          <w:b/>
+          <w:bCs/>
+          <w:color w:val="000000"/>
+          <w:kern w:val="0"/>
+          <w14:ligatures w14:val="none"/>
+        </w:rPr>
+        <w:t>6. Results</w:t>
+      </w:r>
+    </w:p>
+    <w:p>
+      <w:pPr>
+        <w:spacing w:before="280" w:after="80" w:line="240" w:lineRule="auto"/>
+        <w:outlineLvl w:val="2"/>
+        <w:rPr>
+          <w:rFonts w:ascii="Times New Roman" w:eastAsia="Times New Roman" w:hAnsi="Times New Roman" w:cs="Times New Roman"/>
+          <w:b/>
+          <w:bCs/>
+          <w:kern w:val="0"/>
+          <w14:ligatures w14:val="none"/>
+        </w:rPr>
+      </w:pPr>
+      <w:r>
+        <w:rPr>
+          <w:rFonts w:ascii="Times New Roman" w:eastAsia="Times New Roman" w:hAnsi="Times New Roman" w:cs="Times New Roman"/>
+          <w:b/>
+          <w:bCs/>
+          <w:color w:val="000000"/>
+          <w:kern w:val="0"/>
+          <w14:ligatures w14:val="none"/>
+        </w:rPr>
+        <w:t>6.1 Title-Based Analysis (Trump-filtered)</w:t>
+      </w:r>
+    </w:p>
+    <w:p>
+      <w:pPr>
+        <w:spacing w:before="240" w:after="240" w:line="240" w:lineRule="auto"/>
+        <w:rPr>
+          <w:rFonts w:ascii="Times New Roman" w:eastAsia="Times New Roman" w:hAnsi="Times New Roman" w:cs="Times New Roman"/>
+          <w:kern w:val="0"/>
+          <w14:ligatures w14:val="none"/>
+        </w:rPr>
+      </w:pPr>
+      <w:r>
+        <w:rPr>
+          <w:rFonts w:ascii="Times New Roman" w:eastAsia="Times New Roman" w:hAnsi="Times New Roman" w:cs="Times New Roman"/>
+          <w:color w:val="000000"/>
+          <w:kern w:val="0"/>
+          <w14:ligatures w14:val="none"/>
+        </w:rPr>
+        <w:t xml:space="preserve">As a baseline, analysis using titles alone shows limited but observable differences. Progressive channels emphasize conflict-related terms (e.g., </w:t>
+      </w:r>
+      <w:r>
+        <w:rPr>
+          <w:rFonts w:ascii="Times New Roman" w:eastAsia="Times New Roman" w:hAnsi="Times New Roman" w:cs="Times New Roman"/>
+          <w:i/>
+          <w:iCs/>
+          <w:color w:val="000000"/>
+          <w:kern w:val="0"/>
+          <w14:ligatures w14:val="none"/>
+        </w:rPr>
+        <w:t>“erupts,” “brutal,” “collapse”</w:t>
+      </w:r>
+      <w:r>
+        <w:rPr>
+          <w:rFonts w:ascii="Times New Roman" w:eastAsia="Times New Roman" w:hAnsi="Times New Roman" w:cs="Times New Roman"/>
+          <w:color w:val="000000"/>
+          <w:kern w:val="0"/>
+          <w14:ligatures w14:val="none"/>
+        </w:rPr>
+        <w:t xml:space="preserve">), while conservative channels focus more on events and figures (e.g., </w:t>
+      </w:r>
+      <w:r>
+        <w:rPr>
+          <w:rFonts w:ascii="Times New Roman" w:eastAsia="Times New Roman" w:hAnsi="Times New Roman" w:cs="Times New Roman"/>
+          <w:i/>
+          <w:iCs/>
+          <w:color w:val="000000"/>
+          <w:kern w:val="0"/>
+          <w14:ligatures w14:val="none"/>
+        </w:rPr>
+        <w:t>“celebration,” “cabinet,” “Melania”</w:t>
+      </w:r>
+      <w:r>
+        <w:rPr>
+          <w:rFonts w:ascii="Times New Roman" w:eastAsia="Times New Roman" w:hAnsi="Times New Roman" w:cs="Times New Roman"/>
+          <w:color w:val="000000"/>
+          <w:kern w:val="0"/>
+          <w14:ligatures w14:val="none"/>
+        </w:rPr>
+        <w:t>).</w:t>
+      </w:r>
+    </w:p>
+    <w:p>
+      <w:pPr>
+        <w:spacing w:before="240" w:after="240" w:line="240" w:lineRule="auto"/>
+        <w:rPr>
+          <w:rFonts w:ascii="Times New Roman" w:eastAsia="Times New Roman" w:hAnsi="Times New Roman" w:cs="Times New Roman"/>
+          <w:kern w:val="0"/>
+          <w14:ligatures w14:val="none"/>
+        </w:rPr>
+      </w:pPr>
+      <w:r>
+        <w:rPr>
+          <w:rFonts w:ascii="Times New Roman" w:eastAsia="Times New Roman" w:hAnsi="Times New Roman" w:cs="Times New Roman"/>
+          <w:color w:val="000000"/>
+          <w:kern w:val="0"/>
+          <w14:ligatures w14:val="none"/>
+        </w:rPr>
+        <w:t>Sentiment shows a clear contrast: progressive titles are strongly negative (47 negative vs. 4 positive), whereas conservative titles are more positive (10 positive vs. 6 negative). However, titles provide only a surface-level view due to their brevity.</w:t>
+      </w:r>
+    </w:p>
+    <w:p>
+      <w:pPr>
+        <w:spacing w:before="280" w:after="80" w:line="240" w:lineRule="auto"/>
+        <w:outlineLvl w:val="2"/>
+        <w:rPr>
+          <w:rFonts w:ascii="Times New Roman" w:eastAsia="Times New Roman" w:hAnsi="Times New Roman" w:cs="Times New Roman"/>
+          <w:b/>
+          <w:bCs/>
+          <w:kern w:val="0"/>
+          <w14:ligatures w14:val="none"/>
+        </w:rPr>
+      </w:pPr>
+      <w:r>
+        <w:rPr>
+          <w:rFonts w:ascii="Times New Roman" w:eastAsia="Times New Roman" w:hAnsi="Times New Roman" w:cs="Times New Roman"/>
+          <w:b/>
+          <w:bCs/>
+          <w:color w:val="000000"/>
+          <w:kern w:val="0"/>
+          <w14:ligatures w14:val="none"/>
+        </w:rPr>
+        <w:t>6.2 Title-and-Comment Analysis (Trump-filtered)</w:t>
+      </w:r>
+    </w:p>
+    <w:p>
+      <w:pPr>
+        <w:spacing w:before="240" w:after="240" w:line="240" w:lineRule="auto"/>
+        <w:rPr>
+          <w:rFonts w:ascii="Times New Roman" w:eastAsia="Times New Roman" w:hAnsi="Times New Roman" w:cs="Times New Roman"/>
+          <w:kern w:val="0"/>
+          <w14:ligatures w14:val="none"/>
+        </w:rPr>
+      </w:pPr>
+      <w:r>
+        <w:rPr>
+          <w:rFonts w:ascii="Times New Roman" w:eastAsia="Times New Roman" w:hAnsi="Times New Roman" w:cs="Times New Roman"/>
+          <w:color w:val="000000"/>
+          <w:kern w:val="0"/>
+          <w14:ligatures w14:val="none"/>
+        </w:rPr>
+        <w:t xml:space="preserve">With comments included, differences become clearer. Unigram results show distinct vocabularies, with conservative discourse including terms such as </w:t>
+      </w:r>
+      <w:r>
+        <w:rPr>
+          <w:rFonts w:ascii="Times New Roman" w:eastAsia="Times New Roman" w:hAnsi="Times New Roman" w:cs="Times New Roman"/>
+          <w:i/>
+          <w:iCs/>
+          <w:color w:val="000000"/>
+          <w:kern w:val="0"/>
+          <w14:ligatures w14:val="none"/>
+        </w:rPr>
+        <w:t>“bless,” “reuters,”</w:t>
+      </w:r>
+      <w:r>
+        <w:rPr>
+          <w:rFonts w:ascii="Times New Roman" w:eastAsia="Times New Roman" w:hAnsi="Times New Roman" w:cs="Times New Roman"/>
+          <w:color w:val="000000"/>
+          <w:kern w:val="0"/>
+          <w14:ligatures w14:val="none"/>
+        </w:rPr>
+        <w:t xml:space="preserve"> and </w:t>
+      </w:r>
+      <w:r>
+        <w:rPr>
+          <w:rFonts w:ascii="Times New Roman" w:eastAsia="Times New Roman" w:hAnsi="Times New Roman" w:cs="Times New Roman"/>
+          <w:i/>
+          <w:iCs/>
+          <w:color w:val="000000"/>
+          <w:kern w:val="0"/>
+          <w14:ligatures w14:val="none"/>
+        </w:rPr>
+        <w:t>“smartmatic,”</w:t>
+      </w:r>
+      <w:r>
+        <w:rPr>
+          <w:rFonts w:ascii="Times New Roman" w:eastAsia="Times New Roman" w:hAnsi="Times New Roman" w:cs="Times New Roman"/>
+          <w:color w:val="000000"/>
+          <w:kern w:val="0"/>
+          <w14:ligatures w14:val="none"/>
+        </w:rPr>
+        <w:t xml:space="preserve"> while progressive discourse includes </w:t>
+      </w:r>
+      <w:r>
+        <w:rPr>
+          <w:rFonts w:ascii="Times New Roman" w:eastAsia="Times New Roman" w:hAnsi="Times New Roman" w:cs="Times New Roman"/>
+          <w:i/>
+          <w:iCs/>
+          <w:color w:val="000000"/>
+          <w:kern w:val="0"/>
+          <w14:ligatures w14:val="none"/>
+        </w:rPr>
+        <w:t>“insane,” “muslims,”</w:t>
+      </w:r>
+      <w:r>
+        <w:rPr>
+          <w:rFonts w:ascii="Times New Roman" w:eastAsia="Times New Roman" w:hAnsi="Times New Roman" w:cs="Times New Roman"/>
+          <w:color w:val="000000"/>
+          <w:kern w:val="0"/>
+          <w14:ligatures w14:val="none"/>
+        </w:rPr>
+        <w:t xml:space="preserve"> and </w:t>
+      </w:r>
+      <w:r>
+        <w:rPr>
+          <w:rFonts w:ascii="Times New Roman" w:eastAsia="Times New Roman" w:hAnsi="Times New Roman" w:cs="Times New Roman"/>
+          <w:i/>
+          <w:iCs/>
+          <w:color w:val="000000"/>
+          <w:kern w:val="0"/>
+          <w14:ligatures w14:val="none"/>
+        </w:rPr>
+        <w:t>“criminal.”</w:t>
+      </w:r>
+    </w:p>
+    <w:p>
+      <w:pPr>
+        <w:spacing w:before="240" w:after="240" w:line="240" w:lineRule="auto"/>
+        <w:rPr>
+          <w:rFonts w:ascii="Times New Roman" w:eastAsia="Times New Roman" w:hAnsi="Times New Roman" w:cs="Times New Roman"/>
+          <w:kern w:val="0"/>
+          <w14:ligatures w14:val="none"/>
+        </w:rPr>
+      </w:pPr>
+      <w:r>
+        <w:rPr>
+          <w:rFonts w:ascii="Times New Roman" w:eastAsia="Times New Roman" w:hAnsi="Times New Roman" w:cs="Times New Roman"/>
+          <w:color w:val="000000"/>
+          <w:kern w:val="0"/>
+          <w14:ligatures w14:val="none"/>
+        </w:rPr>
+        <w:t xml:space="preserve">Bigram analysis reveals stronger framing differences. Conservative channels use phrases such as </w:t>
+      </w:r>
+      <w:r>
+        <w:rPr>
+          <w:rFonts w:ascii="Times New Roman" w:eastAsia="Times New Roman" w:hAnsi="Times New Roman" w:cs="Times New Roman"/>
+          <w:i/>
+          <w:iCs/>
+          <w:color w:val="000000"/>
+          <w:kern w:val="0"/>
+          <w14:ligatures w14:val="none"/>
+        </w:rPr>
+        <w:t>“god bless,” “propaganda trick,”</w:t>
+      </w:r>
+      <w:r>
+        <w:rPr>
+          <w:rFonts w:ascii="Times New Roman" w:eastAsia="Times New Roman" w:hAnsi="Times New Roman" w:cs="Times New Roman"/>
+          <w:color w:val="000000"/>
+          <w:kern w:val="0"/>
+          <w14:ligatures w14:val="none"/>
+        </w:rPr>
+        <w:t xml:space="preserve"> and </w:t>
+      </w:r>
+      <w:r>
+        <w:rPr>
+          <w:rFonts w:ascii="Times New Roman" w:eastAsia="Times New Roman" w:hAnsi="Times New Roman" w:cs="Times New Roman"/>
+          <w:i/>
+          <w:iCs/>
+          <w:color w:val="000000"/>
+          <w:kern w:val="0"/>
+          <w14:ligatures w14:val="none"/>
+        </w:rPr>
+        <w:t>“oil prices,”</w:t>
+      </w:r>
+      <w:r>
+        <w:rPr>
+          <w:rFonts w:ascii="Times New Roman" w:eastAsia="Times New Roman" w:hAnsi="Times New Roman" w:cs="Times New Roman"/>
+          <w:color w:val="000000"/>
+          <w:kern w:val="0"/>
+          <w14:ligatures w14:val="none"/>
+        </w:rPr>
+        <w:t xml:space="preserve"> combining evaluative language with issue references. Progressive channels use more critical expressions such as </w:t>
+      </w:r>
+      <w:r>
+        <w:rPr>
+          <w:rFonts w:ascii="Times New Roman" w:eastAsia="Times New Roman" w:hAnsi="Times New Roman" w:cs="Times New Roman"/>
+          <w:i/>
+          <w:iCs/>
+          <w:color w:val="000000"/>
+          <w:kern w:val="0"/>
+          <w14:ligatures w14:val="none"/>
+        </w:rPr>
+        <w:t>“destroyed biden’s”</w:t>
+      </w:r>
+      <w:r>
+        <w:rPr>
+          <w:rFonts w:ascii="Times New Roman" w:eastAsia="Times New Roman" w:hAnsi="Times New Roman" w:cs="Times New Roman"/>
+          <w:color w:val="000000"/>
+          <w:kern w:val="0"/>
+          <w14:ligatures w14:val="none"/>
+        </w:rPr>
+        <w:t xml:space="preserve"> and </w:t>
+      </w:r>
+      <w:r>
+        <w:rPr>
+          <w:rFonts w:ascii="Times New Roman" w:eastAsia="Times New Roman" w:hAnsi="Times New Roman" w:cs="Times New Roman"/>
+          <w:i/>
+          <w:iCs/>
+          <w:color w:val="000000"/>
+          <w:kern w:val="0"/>
+          <w14:ligatures w14:val="none"/>
+        </w:rPr>
+        <w:t>“war crimes.”</w:t>
+      </w:r>
+    </w:p>
+    <w:p>
+      <w:pPr>
+        <w:spacing w:before="240" w:after="240" w:line="240" w:lineRule="auto"/>
+        <w:rPr>
+          <w:rFonts w:ascii="Times New Roman" w:eastAsia="Times New Roman" w:hAnsi="Times New Roman" w:cs="Times New Roman"/>
+          <w:kern w:val="0"/>
+          <w14:ligatures w14:val="none"/>
+        </w:rPr>
+      </w:pPr>
+      <w:r>
+        <w:rPr>
+          <w:rFonts w:ascii="Times New Roman" w:eastAsia="Times New Roman" w:hAnsi="Times New Roman" w:cs="Times New Roman"/>
+          <w:color w:val="000000"/>
+          <w:kern w:val="0"/>
+          <w14:ligatures w14:val="none"/>
+        </w:rPr>
+        <w:t>Sentiment further reinforces this divide: progressive discourse is strongly negative (1086 negative vs. 507 positive), while conservative discourse is more balanced (366 negative vs. 395 positive). Overall, comments reveal clearer differences in framing and tone than titles alone.</w:t>
+      </w:r>
+    </w:p>
+    <w:p>
+      <w:pPr>
+        <w:spacing w:before="280" w:after="80" w:line="240" w:lineRule="auto"/>
+        <w:outlineLvl w:val="2"/>
+        <w:rPr>
+          <w:rFonts w:ascii="Times New Roman" w:eastAsia="Times New Roman" w:hAnsi="Times New Roman" w:cs="Times New Roman"/>
+          <w:b/>
+          <w:bCs/>
+          <w:kern w:val="0"/>
+          <w14:ligatures w14:val="none"/>
+        </w:rPr>
+      </w:pPr>
+      <w:r>
+        <w:rPr>
+          <w:rFonts w:ascii="Times New Roman" w:eastAsia="Times New Roman" w:hAnsi="Times New Roman" w:cs="Times New Roman"/>
+          <w:b/>
+          <w:bCs/>
+          <w:color w:val="000000"/>
+          <w:kern w:val="0"/>
+          <w14:ligatures w14:val="none"/>
+        </w:rPr>
+        <w:t>6.3 Analysis without Keyword Filtering</w:t>
+      </w:r>
+    </w:p>
+    <w:p>
+      <w:pPr>
+        <w:spacing w:before="240" w:after="240" w:line="240" w:lineRule="auto"/>
+        <w:rPr>
+          <w:rFonts w:ascii="Times New Roman" w:eastAsia="Times New Roman" w:hAnsi="Times New Roman" w:cs="Times New Roman"/>
+          <w:kern w:val="0"/>
+          <w14:ligatures w14:val="none"/>
+        </w:rPr>
+      </w:pPr>
+      <w:r>
+        <w:rPr>
+          <w:rFonts w:ascii="Times New Roman" w:eastAsia="Times New Roman" w:hAnsi="Times New Roman" w:cs="Times New Roman"/>
+          <w:color w:val="000000"/>
+          <w:kern w:val="0"/>
+          <w14:ligatures w14:val="none"/>
+        </w:rPr>
+        <w:t xml:space="preserve">Without topic restriction, differences persist but become more general. Progressive discourse emphasizes international conflict and normative judgment (e.g., </w:t>
+      </w:r>
+      <w:r>
+        <w:rPr>
+          <w:rFonts w:ascii="Times New Roman" w:eastAsia="Times New Roman" w:hAnsi="Times New Roman" w:cs="Times New Roman"/>
+          <w:i/>
+          <w:iCs/>
+          <w:color w:val="000000"/>
+          <w:kern w:val="0"/>
+          <w14:ligatures w14:val="none"/>
+        </w:rPr>
+        <w:t>“war crimes,” “human rights”</w:t>
+      </w:r>
+      <w:r>
+        <w:rPr>
+          <w:rFonts w:ascii="Times New Roman" w:eastAsia="Times New Roman" w:hAnsi="Times New Roman" w:cs="Times New Roman"/>
+          <w:color w:val="000000"/>
+          <w:kern w:val="0"/>
+          <w14:ligatures w14:val="none"/>
+        </w:rPr>
+        <w:t xml:space="preserve">), while conservative discourse focuses on domestic policy and identity (e.g., </w:t>
+      </w:r>
+      <w:r>
+        <w:rPr>
+          <w:rFonts w:ascii="Times New Roman" w:eastAsia="Times New Roman" w:hAnsi="Times New Roman" w:cs="Times New Roman"/>
+          <w:i/>
+          <w:iCs/>
+          <w:color w:val="000000"/>
+          <w:kern w:val="0"/>
+          <w14:ligatures w14:val="none"/>
+        </w:rPr>
+        <w:t>“save america,” “voter id”</w:t>
+      </w:r>
+      <w:r>
+        <w:rPr>
+          <w:rFonts w:ascii="Times New Roman" w:eastAsia="Times New Roman" w:hAnsi="Times New Roman" w:cs="Times New Roman"/>
+          <w:color w:val="000000"/>
+          <w:kern w:val="0"/>
+          <w14:ligatures w14:val="none"/>
+        </w:rPr>
+        <w:t>).</w:t>
+      </w:r>
+    </w:p>
+    <w:p>
+      <w:pPr>
+        <w:spacing w:before="240" w:after="240" w:line="240" w:lineRule="auto"/>
+        <w:rPr>
+          <w:rFonts w:ascii="Times New Roman" w:eastAsia="Times New Roman" w:hAnsi="Times New Roman" w:cs="Times New Roman"/>
+          <w:kern w:val="0"/>
+          <w14:ligatures w14:val="none"/>
+        </w:rPr>
+      </w:pPr>
+      <w:r>
+        <w:rPr>
+          <w:rFonts w:ascii="Times New Roman" w:eastAsia="Times New Roman" w:hAnsi="Times New Roman" w:cs="Times New Roman"/>
+          <w:color w:val="000000"/>
+          <w:kern w:val="0"/>
+          <w14:ligatures w14:val="none"/>
+        </w:rPr>
+        <w:t>Sentiment remains more negative for progressive channels (1793 negative vs. 832 positive) compared to conservatives (670 negative vs. 515 positive). These results suggest that polarization is not limited to a single topic, though it is amplified in Trump-related content.</w:t>
+      </w:r>
+    </w:p>
+    <w:p>
+      <w:pPr>
+        <w:spacing w:before="280" w:after="80" w:line="240" w:lineRule="auto"/>
+        <w:outlineLvl w:val="2"/>
+        <w:rPr>
+          <w:rFonts w:ascii="Times New Roman" w:eastAsia="Times New Roman" w:hAnsi="Times New Roman" w:cs="Times New Roman"/>
+          <w:b/>
+          <w:bCs/>
+          <w:kern w:val="0"/>
+          <w14:ligatures w14:val="none"/>
+        </w:rPr>
+      </w:pPr>
+      <w:r>
+        <w:rPr>
+          <w:rFonts w:ascii="Times New Roman" w:eastAsia="Times New Roman" w:hAnsi="Times New Roman" w:cs="Times New Roman"/>
+          <w:b/>
+          <w:bCs/>
+          <w:color w:val="000000"/>
+          <w:kern w:val="0"/>
+          <w14:ligatures w14:val="none"/>
+        </w:rPr>
+        <w:t>6.4 Network Analysis</w:t>
+      </w:r>
+    </w:p>
+    <w:p>
+      <w:pPr>
+        <w:spacing w:before="240" w:after="240" w:line="240" w:lineRule="auto"/>
+        <w:rPr>
+          <w:rFonts w:ascii="Times New Roman" w:eastAsia="Times New Roman" w:hAnsi="Times New Roman" w:cs="Times New Roman"/>
+          <w:kern w:val="0"/>
+          <w14:ligatures w14:val="none"/>
+        </w:rPr>
+      </w:pPr>
+      <w:r>
+        <w:rPr>
+          <w:rFonts w:ascii="Times New Roman" w:eastAsia="Times New Roman" w:hAnsi="Times New Roman" w:cs="Times New Roman"/>
+          <w:color w:val="000000"/>
+          <w:kern w:val="0"/>
+          <w14:ligatures w14:val="none"/>
+        </w:rPr>
+        <w:lastRenderedPageBreak/>
+        <w:t>The network shows no clear community structure (modularity = 2.076521e-16). However, channels within the same ideology are slightly more similar (0.170) than cross-ideological pairs (0.124), indicating weak but present ideological alignment.</w:t>
+      </w:r>
+    </w:p>
+    <w:p>
+      <w:pPr>
+        <w:spacing w:before="240" w:after="240" w:line="240" w:lineRule="auto"/>
+        <w:rPr>
+          <w:rFonts w:ascii="Times New Roman" w:eastAsia="Times New Roman" w:hAnsi="Times New Roman" w:cs="Times New Roman"/>
+          <w:kern w:val="0"/>
+          <w14:ligatures w14:val="none"/>
+        </w:rPr>
+      </w:pPr>
+      <w:r>
+        <w:rPr>
+          <w:rFonts w:ascii="Times New Roman" w:eastAsia="Times New Roman" w:hAnsi="Times New Roman" w:cs="Times New Roman"/>
+          <w:color w:val="000000"/>
+          <w:kern w:val="0"/>
+          <w14:ligatures w14:val="none"/>
+        </w:rPr>
+        <w:t>As shown in Figure 1, channels are not separated into distinct clusters, and connections are distributed across groups. This suggests that while ideological similarity exists, it does not result in strong structural separation.</w:t>
+      </w:r>
+    </w:p>
+    <w:p>
+      <w:pPr>
+        <w:spacing w:after="0" w:line="240" w:lineRule="auto"/>
+        <w:rPr>
+          <w:rFonts w:ascii="Times New Roman" w:eastAsia="Times New Roman" w:hAnsi="Times New Roman" w:cs="Times New Roman"/>
+          <w:kern w:val="0"/>
+          <w14:ligatures w14:val="none"/>
+        </w:rPr>
+      </w:pPr>
+    </w:p>
+    <w:p>
+      <w:pPr>
+        <w:spacing w:before="240" w:after="240" w:line="240" w:lineRule="auto"/>
+        <w:jc w:val="center"/>
+        <w:rPr>
+          <w:rFonts w:ascii="Times New Roman" w:eastAsia="Times New Roman" w:hAnsi="Times New Roman" w:cs="Times New Roman"/>
+          <w:kern w:val="0"/>
+          <w14:ligatures w14:val="none"/>
+        </w:rPr>
+      </w:pPr>
+      <w:r>
+        <w:rPr>
+          <w:rFonts w:ascii="Times New Roman" w:eastAsia="Times New Roman" w:hAnsi="Times New Roman" w:cs="Times New Roman"/>
+          <w:noProof/>
+          <w:color w:val="000000"/>
+          <w:kern w:val="0"/>
+          <w:bdr w:val="none" w:sz="0" w:space="0" w:color="auto" w:frame="1"/>
+          <w14:ligatures w14:val="none"/>
+        </w:rPr>
+        <w:drawing>
+          <wp:inline distT="0" distB="0" distL="0" distR="0" wp14:anchorId="56356873" wp14:editId="118365EB">
+            <wp:extent cx="3245485" cy="2704465"/>
+            <wp:effectExtent l="0" t="0" r="5715" b="635"/>
+            <wp:docPr id="1390877980" name="Picture 1"/>
+            <wp:cNvGraphicFramePr>
+              <a:graphicFrameLocks xmlns:a="http://schemas.openxmlformats.org/drawingml/2006/main" noChangeAspect="1"/>
+            </wp:cNvGraphicFramePr>
+            <a:graphic xmlns:a="http://schemas.openxmlformats.org/drawingml/2006/main">
+              <a:graphicData uri="http://schemas.openxmlformats.org/drawingml/2006/picture">
+                <pic:pic xmlns:pic="http://schemas.openxmlformats.org/drawingml/2006/picture">
+                  <pic:nvPicPr>
+                    <pic:cNvPr id="0" name="Picture 1"/>
+                    <pic:cNvPicPr>
+                      <a:picLocks noChangeAspect="1" noChangeArrowheads="1"/>
+                    </pic:cNvPicPr>
+                  </pic:nvPicPr>
+                  <pic:blipFill>
+                    <a:blip r:embed="rId4" cstate="print">
+                      <a:extLst>
+                        <a:ext uri="{28A0092B-C50C-407E-A947-70E740481C1C}">
+                          <a14:useLocalDpi xmlns:a14="http://schemas.microsoft.com/office/drawing/2010/main" val="0"/>
+                        </a:ext>
+                      </a:extLst>
+                    </a:blip>
+                    <a:srcRect/>
+                    <a:stretch>
+                      <a:fillRect/>
+                    </a:stretch>
+                  </pic:blipFill>
+                  <pic:spPr bwMode="auto">
+                    <a:xfrm>
+                      <a:off x="0" y="0"/>
+                      <a:ext cx="3245485" cy="2704465"/>
+                    </a:xfrm>
+                    <a:prstGeom prst="rect">
+                      <a:avLst/>
+                    </a:prstGeom>
+                    <a:noFill/>
+                    <a:ln>
+                      <a:noFill/>
+                    </a:ln>
+                  </pic:spPr>
+                </pic:pic>
+              </a:graphicData>
+            </a:graphic>
+          </wp:inline>
+        </w:drawing>
+      </w:r>
+    </w:p>
+    <w:p>
+      <w:pPr>
+        <w:spacing w:before="240" w:after="240" w:line="240" w:lineRule="auto"/>
+        <w:jc w:val="center"/>
+        <w:rPr>
+          <w:rFonts w:ascii="Times New Roman" w:eastAsia="Times New Roman" w:hAnsi="Times New Roman" w:cs="Times New Roman"/>
+          <w:kern w:val="0"/>
+          <w14:ligatures w14:val="none"/>
+        </w:rPr>
+      </w:pPr>
+      <w:r>
+        <w:rPr>
+          <w:rFonts w:ascii="Times New Roman" w:eastAsia="Times New Roman" w:hAnsi="Times New Roman" w:cs="Times New Roman"/>
+          <w:b/>
+          <w:bCs/>
+          <w:color w:val="000000"/>
+          <w:kern w:val="0"/>
+          <w14:ligatures w14:val="none"/>
+        </w:rPr>
+        <w:t>Figure 1.</w:t>
+      </w:r>
+      <w:r>
+        <w:rPr>
+          <w:rFonts w:ascii="Times New Roman" w:eastAsia="Times New Roman" w:hAnsi="Times New Roman" w:cs="Times New Roman"/>
+          <w:color w:val="000000"/>
+          <w:kern w:val="0"/>
+          <w14:ligatures w14:val="none"/>
+        </w:rPr>
+        <w:t xml:space="preserve"> Similarity-based network of YouTube channels. Nodes represent channels colored by ideology (red = progressive, blue = conservative), and edges indicate textual similarity.</w:t>
+      </w:r>
+    </w:p>
+    <w:p>
+      <w:pPr>
+        <w:spacing w:before="280" w:after="80" w:line="240" w:lineRule="auto"/>
+        <w:outlineLvl w:val="2"/>
+        <w:rPr>
+          <w:rFonts w:ascii="Times New Roman" w:eastAsia="Times New Roman" w:hAnsi="Times New Roman" w:cs="Times New Roman"/>
+          <w:b/>
+          <w:bCs/>
+          <w:kern w:val="0"/>
+          <w14:ligatures w14:val="none"/>
+        </w:rPr>
+      </w:pPr>
+      <w:r>
+        <w:rPr>
+          <w:rFonts w:ascii="Times New Roman" w:eastAsia="Times New Roman" w:hAnsi="Times New Roman" w:cs="Times New Roman"/>
+          <w:b/>
+          <w:bCs/>
+          <w:color w:val="000000"/>
+          <w:kern w:val="0"/>
+          <w14:ligatures w14:val="none"/>
+        </w:rPr>
+        <w:t>6.5 Synthesis</w:t>
+      </w:r>
+    </w:p>
+    <w:p>
+      <w:pPr>
+        <w:spacing w:before="240" w:after="240" w:line="240" w:lineRule="auto"/>
+        <w:rPr>
+          <w:rFonts w:ascii="Times New Roman" w:eastAsia="Times New Roman" w:hAnsi="Times New Roman" w:cs="Times New Roman"/>
+          <w:kern w:val="0"/>
+          <w14:ligatures w14:val="none"/>
+        </w:rPr>
+      </w:pPr>
+      <w:r>
+        <w:rPr>
+          <w:rFonts w:ascii="Times New Roman" w:eastAsia="Times New Roman" w:hAnsi="Times New Roman" w:cs="Times New Roman"/>
+          <w:color w:val="000000"/>
+          <w:kern w:val="0"/>
+          <w14:ligatures w14:val="none"/>
+        </w:rPr>
+        <w:t>Overall, polarization is more evident in language than in network structure. Ideological groups differ clearly in vocabulary, framing, and sentiment, but these differences do not translate into strongly separated communities. This suggests that polarization operates primarily through discourse within a shared communication space rather than through fully isolated echo chambers.</w:t>
+      </w:r>
+    </w:p>
+    <w:p>
+      <w:pPr>
+        <w:spacing w:after="0" w:line="240" w:lineRule="auto"/>
+        <w:rPr>
+          <w:rFonts w:ascii="Times New Roman" w:eastAsia="Times New Roman" w:hAnsi="Times New Roman" w:cs="Times New Roman"/>
+          <w:kern w:val="0"/>
+          <w14:ligatures w14:val="none"/>
+        </w:rPr>
+      </w:pPr>
+    </w:p>
+    <w:p>
+      <w:pPr>
+        <w:spacing w:line="240" w:lineRule="auto"/>
+        <w:rPr>
+          <w:rFonts w:ascii="Times New Roman" w:eastAsia="Times New Roman" w:hAnsi="Times New Roman" w:cs="Times New Roman"/>
+          <w:kern w:val="0"/>
+          <w14:ligatures w14:val="none"/>
+        </w:rPr>
+      </w:pPr>
+      <w:r>
+        <w:rPr>
+          <w:rFonts w:ascii="Times New Roman" w:eastAsia="Times New Roman" w:hAnsi="Times New Roman" w:cs="Times New Roman"/>
+          <w:b/>
+          <w:bCs/>
+          <w:color w:val="000000"/>
+          <w:kern w:val="0"/>
+          <w14:ligatures w14:val="none"/>
+        </w:rPr>
+        <w:t>7. Limitations</w:t>
+      </w:r>
+    </w:p>
+    <w:p>
+      <w:pPr>
+        <w:spacing w:line="240" w:lineRule="auto"/>
+        <w:rPr>
+          <w:rFonts w:ascii="Times New Roman" w:eastAsia="Times New Roman" w:hAnsi="Times New Roman" w:cs="Times New Roman"/>
+          <w:kern w:val="0"/>
+          <w14:ligatures w14:val="none"/>
+        </w:rPr>
+      </w:pPr>
+      <w:r>
+        <w:rPr>
+          <w:rFonts w:ascii="Times New Roman" w:eastAsia="Times New Roman" w:hAnsi="Times New Roman" w:cs="Times New Roman"/>
+          <w:color w:val="000000"/>
+          <w:kern w:val="0"/>
+          <w14:ligatures w14:val="none"/>
+        </w:rPr>
+        <w:t>This study has several limitations.</w:t>
+      </w:r>
+    </w:p>
+    <w:p>
+      <w:pPr>
+        <w:spacing w:before="240" w:after="240" w:line="240" w:lineRule="auto"/>
+        <w:rPr>
+          <w:rFonts w:ascii="Times New Roman" w:eastAsia="Times New Roman" w:hAnsi="Times New Roman" w:cs="Times New Roman"/>
+          <w:kern w:val="0"/>
+          <w14:ligatures w14:val="none"/>
+        </w:rPr>
+      </w:pPr>
+      <w:r>
+        <w:rPr>
+          <w:rFonts w:ascii="Times New Roman" w:eastAsia="Times New Roman" w:hAnsi="Times New Roman" w:cs="Times New Roman"/>
+          <w:color w:val="000000"/>
+          <w:kern w:val="0"/>
+          <w14:ligatures w14:val="none"/>
+        </w:rPr>
+        <w:t>First, the classification of channels into ideological categories relies on manual labeling. Although this approach allows for careful interpretation of channel content and positioning, it introduces a degree of subjectivity. In practice, political content is not always strictly binary, and some channels may exhibit mixed or shifting ideological orientations that are not fully captured by a left–right classification.</w:t>
+      </w:r>
+    </w:p>
+    <w:p>
+      <w:pPr>
+        <w:spacing w:before="240" w:after="240" w:line="240" w:lineRule="auto"/>
+        <w:rPr>
+          <w:rFonts w:ascii="Times New Roman" w:eastAsia="Times New Roman" w:hAnsi="Times New Roman" w:cs="Times New Roman"/>
+          <w:kern w:val="0"/>
+          <w14:ligatures w14:val="none"/>
+        </w:rPr>
+      </w:pPr>
+      <w:r>
+        <w:rPr>
+          <w:rFonts w:ascii="Times New Roman" w:eastAsia="Times New Roman" w:hAnsi="Times New Roman" w:cs="Times New Roman"/>
+          <w:color w:val="000000"/>
+          <w:kern w:val="0"/>
+          <w14:ligatures w14:val="none"/>
+        </w:rPr>
+        <w:lastRenderedPageBreak/>
+        <w:t>Second, the dataset exhibits imbalance across ideological groups, particularly in the Trump-filtered subset of videos. Differences in the number of videos and associated comments between progressive and conservative channels may influence the observed patterns in both linguistic and sentiment analyses. As a result, some findings may reflect underlying data distribution differences rather than purely ideological effects.</w:t>
+      </w:r>
+    </w:p>
+    <w:p>
+      <w:pPr>
+        <w:spacing w:before="240" w:after="240" w:line="240" w:lineRule="auto"/>
+        <w:rPr>
+          <w:rFonts w:ascii="Times New Roman" w:eastAsia="Times New Roman" w:hAnsi="Times New Roman" w:cs="Times New Roman"/>
+          <w:kern w:val="0"/>
+          <w14:ligatures w14:val="none"/>
+        </w:rPr>
+      </w:pPr>
+      <w:r>
+        <w:rPr>
+          <w:rFonts w:ascii="Times New Roman" w:eastAsia="Times New Roman" w:hAnsi="Times New Roman" w:cs="Times New Roman"/>
+          <w:color w:val="000000"/>
+          <w:kern w:val="0"/>
+          <w14:ligatures w14:val="none"/>
+        </w:rPr>
+        <w:t>Third, the network analysis is based on textual similarity rather than direct interaction between channels. As such, the constructed network does not capture actual relationships such as audience overlap, recommendation pathways, or subscription behavior. This limits the ability to draw strong conclusions about the presence or absence of echo chambers in a structural sense, as the network reflects similarity in discourse rather than real patterns of information flow. </w:t>
+      </w:r>
+    </w:p>
+    <w:p>
+      <w:pPr>
+        <w:spacing w:after="0" w:line="240" w:lineRule="auto"/>
+        <w:rPr>
+          <w:rFonts w:ascii="Times New Roman" w:eastAsia="Times New Roman" w:hAnsi="Times New Roman" w:cs="Times New Roman"/>
+          <w:kern w:val="0"/>
+          <w14:ligatures w14:val="none"/>
+        </w:rPr>
+      </w:pPr>
+    </w:p>
+    <w:p>
+      <w:pPr>
+        <w:spacing w:line="240" w:lineRule="auto"/>
+        <w:rPr>
+          <w:rFonts w:ascii="Times New Roman" w:eastAsia="Times New Roman" w:hAnsi="Times New Roman" w:cs="Times New Roman"/>
+          <w:kern w:val="0"/>
+          <w14:ligatures w14:val="none"/>
+        </w:rPr>
+      </w:pPr>
+      <w:r>
+        <w:rPr>
+          <w:rFonts w:ascii="Times New Roman" w:eastAsia="Times New Roman" w:hAnsi="Times New Roman" w:cs="Times New Roman"/>
+          <w:b/>
+          <w:bCs/>
+          <w:color w:val="000000"/>
+          <w:kern w:val="0"/>
+          <w14:ligatures w14:val="none"/>
+        </w:rPr>
+        <w:t>8. Conclusion</w:t>
+      </w:r>
+    </w:p>
+    <w:p>
+      <w:pPr>
+        <w:spacing w:line="240" w:lineRule="auto"/>
+        <w:rPr>
+          <w:rFonts w:ascii="Times New Roman" w:eastAsia="Times New Roman" w:hAnsi="Times New Roman" w:cs="Times New Roman"/>
+          <w:kern w:val="0"/>
+          <w14:ligatures w14:val="none"/>
+        </w:rPr>
+      </w:pPr>
+      <w:r>
+        <w:rPr>
+          <w:rFonts w:ascii="Times New Roman" w:eastAsia="Times New Roman" w:hAnsi="Times New Roman" w:cs="Times New Roman"/>
+          <w:color w:val="000000"/>
+          <w:kern w:val="0"/>
+          <w14:ligatures w14:val="none"/>
+        </w:rPr>
+        <w:t>This study examined political polarization in YouTube discourse by integrating linguistic and network-based analyses. The results show that ideological differences are clearly reflected in language use, including vocabulary, framing, and sentiment, with progressive and conservative channels exhibiting distinct patterns of expression.</w:t>
+      </w:r>
+    </w:p>
+    <w:p>
+      <w:pPr>
+        <w:spacing w:line="240" w:lineRule="auto"/>
+        <w:rPr>
+          <w:rFonts w:ascii="Times New Roman" w:eastAsia="Times New Roman" w:hAnsi="Times New Roman" w:cs="Times New Roman"/>
+          <w:kern w:val="0"/>
+          <w14:ligatures w14:val="none"/>
+        </w:rPr>
+      </w:pPr>
+      <w:r>
+        <w:rPr>
+          <w:rFonts w:ascii="Times New Roman" w:eastAsia="Times New Roman" w:hAnsi="Times New Roman" w:cs="Times New Roman"/>
+          <w:color w:val="000000"/>
+          <w:kern w:val="0"/>
+          <w14:ligatures w14:val="none"/>
+        </w:rPr>
+        <w:t>At the same time, the network analysis reveals only weak structural separation, suggesting that these differences do not fully translate into clearly segregated communities. Instead, the findings indicate that polarization is more strongly manifested in how political issues are interpreted and expressed than in how channels are structurally organized.</w:t>
+      </w:r>
+    </w:p>
+    <w:p>
+      <w:pPr>
+        <w:spacing w:line="240" w:lineRule="auto"/>
+        <w:rPr>
+          <w:rFonts w:ascii="Times New Roman" w:eastAsia="Times New Roman" w:hAnsi="Times New Roman" w:cs="Times New Roman"/>
+          <w:kern w:val="0"/>
+          <w14:ligatures w14:val="none"/>
+        </w:rPr>
+      </w:pPr>
+      <w:r>
+        <w:rPr>
+          <w:rFonts w:ascii="Times New Roman" w:eastAsia="Times New Roman" w:hAnsi="Times New Roman" w:cs="Times New Roman"/>
+          <w:color w:val="000000"/>
+          <w:kern w:val="0"/>
+          <w14:ligatures w14:val="none"/>
+        </w:rPr>
+        <w:t>Overall, this study highlights that polarization in online platforms may operate as a divergence in discourse within a shared communication space, rather than as complete fragmentation into isolated echo chambers.</w:t>
+      </w:r>
     </w:p>
     <w:sectPr>
       <w:pgSz w:w="12240" w:h="15840"/>
@@ -778,7 +2113,7 @@
   <w:style w:type="paragraph" w:default="1" w:styleId="Normal">
     <w:name w:val="Normal"/>
     <w:qFormat/>
-    <w:rsid w:val="005052B4"/>
+    <w:rsid w:val="00E74A4E"/>
   </w:style>
   <w:style w:type="paragraph" w:styleId="Heading1">
     <w:name w:val="heading 1"/>
@@ -807,7 +2142,6 @@
     <w:next w:val="Normal"/>
     <w:link w:val="Heading2Char"/>
     <w:uiPriority w:val="9"/>
-    <w:semiHidden/>
     <w:unhideWhenUsed/>
     <w:qFormat/>
     <w:rsid w:val="0012327B"/>
@@ -830,7 +2164,6 @@
     <w:next w:val="Normal"/>
     <w:link w:val="Heading3Char"/>
     <w:uiPriority w:val="9"/>
-    <w:semiHidden/>
     <w:unhideWhenUsed/>
     <w:qFormat/>
     <w:rsid w:val="0012327B"/>
@@ -1024,7 +2357,6 @@
     <w:basedOn w:val="DefaultParagraphFont"/>
     <w:link w:val="Heading2"/>
     <w:uiPriority w:val="9"/>
-    <w:semiHidden/>
     <w:rsid w:val="0012327B"/>
     <w:rPr>
       <w:rFonts w:asciiTheme="majorHAnsi" w:eastAsiaTheme="majorEastAsia" w:hAnsiTheme="majorHAnsi" w:cstheme="majorBidi"/>
@@ -1038,7 +2370,6 @@
     <w:basedOn w:val="DefaultParagraphFont"/>
     <w:link w:val="Heading3"/>
     <w:uiPriority w:val="9"/>
-    <w:semiHidden/>
     <w:rsid w:val="0012327B"/>
     <w:rPr>
       <w:rFonts w:eastAsiaTheme="majorEastAsia" w:cstheme="majorBidi"/>
@@ -1322,6 +2653,28 @@
       <w:rFonts w:ascii="Times New Roman" w:eastAsia="Times New Roman" w:hAnsi="Times New Roman" w:cs="Times New Roman"/>
       <w:kern w:val="0"/>
       <w14:ligatures w14:val="none"/>
+    </w:rPr>
+  </w:style>
+  <w:style w:type="character" w:styleId="Strong">
+    <w:name w:val="Strong"/>
+    <w:basedOn w:val="DefaultParagraphFont"/>
+    <w:uiPriority w:val="22"/>
+    <w:qFormat/>
+    <w:rsid w:val="00E74A4E"/>
+    <w:rPr>
+      <w:b/>
+      <w:bCs/>
+    </w:rPr>
+  </w:style>
+  <w:style w:type="character" w:styleId="Emphasis">
+    <w:name w:val="Emphasis"/>
+    <w:basedOn w:val="DefaultParagraphFont"/>
+    <w:uiPriority w:val="20"/>
+    <w:qFormat/>
+    <w:rsid w:val="00E74A4E"/>
+    <w:rPr>
+      <w:i/>
+      <w:iCs/>
     </w:rPr>
   </w:style>
 </w:styles>

</xml_diff>